<commit_message>
Proje 4: Veritabanı replikasyonu ve veri senkronizasyonu tamamlandı
</commit_message>
<xml_diff>
--- a/BLM4522_Proje4/Proje4_Rapor.docx
+++ b/BLM4522_Proje4/Proje4_Rapor.docx
@@ -299,15 +299,7 @@
           <w:b/>
           <w:color w:val="000000" w:themeColor="text1"/>
         </w:rPr>
-        <w:t>01.06</w:t>
-      </w:r>
-      <w:r>
-        <w:rPr>
-          <w:rFonts w:cs="Arial"/>
-          <w:b/>
-          <w:color w:val="000000" w:themeColor="text1"/>
-        </w:rPr>
-        <w:t xml:space="preserve">.2026 </w:t>
+        <w:t xml:space="preserve">01.06.2026 </w:t>
       </w:r>
     </w:p>
     <w:p>
@@ -396,6 +388,7 @@
         <w:jc w:val="center"/>
       </w:pPr>
     </w:p>
+    <w:p/>
     <w:p/>
     <w:p/>
     <w:p/>
@@ -407,8 +400,10 @@
           <w:b w:val="0"/>
           <w:bCs w:val="0"/>
           <w:color w:val="auto"/>
+          <w:kern w:val="2"/>
           <w:szCs w:val="22"/>
           <w:lang w:val="tr-TR" w:eastAsia="en-US"/>
+          <w14:ligatures w14:val="standardContextual"/>
         </w:rPr>
         <w:id w:val="-1039284817"/>
         <w:docPartObj>
@@ -416,6 +411,12 @@
           <w:docPartUnique/>
         </w:docPartObj>
       </w:sdtPr>
+      <w:sdtEndPr>
+        <w:rPr>
+          <w:rFonts w:eastAsiaTheme="minorHAnsi"/>
+          <w:szCs w:val="24"/>
+        </w:rPr>
+      </w:sdtEndPr>
       <w:sdtContent>
         <w:p>
           <w:pPr>
@@ -434,28 +435,76 @@
               <w:rFonts w:asciiTheme="minorHAnsi" w:eastAsiaTheme="minorEastAsia" w:hAnsiTheme="minorHAnsi" w:cstheme="minorBidi"/>
               <w:b w:val="0"/>
               <w:noProof/>
+              <w:kern w:val="2"/>
               <w:szCs w:val="24"/>
               <w:lang w:val="tr-TR" w:eastAsia="tr-TR"/>
+              <w14:ligatures w14:val="standardContextual"/>
             </w:rPr>
           </w:pPr>
-          <w:hyperlink r:id="rId6" w:anchor="_Toc231232076" w:history="1">
-            <w:r>
-              <w:rPr>
-                <w:rStyle w:val="Kpr"/>
-                <w:bCs/>
-                <w:noProof/>
-              </w:rPr>
-              <w:t>Proje 1: Veritabanı Performans Optimizasyonu ve İzleme</w:t>
-            </w:r>
+          <w:r>
+            <w:fldChar w:fldCharType="begin"/>
+          </w:r>
+          <w:r>
+            <w:instrText xml:space="preserve"> TOC \o "1-3" \h \z \u </w:instrText>
+          </w:r>
+          <w:r>
+            <w:fldChar w:fldCharType="separate"/>
+          </w:r>
+          <w:hyperlink w:anchor="_Toc231233128" w:history="1">
             <w:r>
               <w:rPr>
                 <w:rStyle w:val="Kpr"/>
                 <w:noProof/>
+              </w:rPr>
+              <w:t>Proje 4:  Veritabanı Yük Dengeleme ve Dağıtık Veritabanı Yapıları</w:t>
+            </w:r>
+            <w:r>
+              <w:rPr>
+                <w:noProof/>
                 <w:webHidden/>
-                <w:color w:val="auto"/>
               </w:rPr>
               <w:tab/>
+            </w:r>
+            <w:r>
+              <w:rPr>
+                <w:noProof/>
+                <w:webHidden/>
+              </w:rPr>
+              <w:fldChar w:fldCharType="begin"/>
+            </w:r>
+            <w:r>
+              <w:rPr>
+                <w:noProof/>
+                <w:webHidden/>
+              </w:rPr>
+              <w:instrText xml:space="preserve"> PAGEREF _Toc231233128 \h </w:instrText>
+            </w:r>
+            <w:r>
+              <w:rPr>
+                <w:noProof/>
+                <w:webHidden/>
+              </w:rPr>
+            </w:r>
+            <w:r>
+              <w:rPr>
+                <w:noProof/>
+                <w:webHidden/>
+              </w:rPr>
+              <w:fldChar w:fldCharType="separate"/>
+            </w:r>
+            <w:r>
+              <w:rPr>
+                <w:noProof/>
+                <w:webHidden/>
+              </w:rPr>
               <w:t>3</w:t>
+            </w:r>
+            <w:r>
+              <w:rPr>
+                <w:noProof/>
+                <w:webHidden/>
+              </w:rPr>
+              <w:fldChar w:fldCharType="end"/>
             </w:r>
           </w:hyperlink>
         </w:p>
@@ -466,27 +515,67 @@
               <w:rFonts w:asciiTheme="minorHAnsi" w:eastAsiaTheme="minorEastAsia" w:hAnsiTheme="minorHAnsi" w:cstheme="minorBidi"/>
               <w:b w:val="0"/>
               <w:noProof/>
+              <w:kern w:val="2"/>
               <w:u w:val="none"/>
               <w:lang w:eastAsia="tr-TR"/>
+              <w14:ligatures w14:val="standardContextual"/>
             </w:rPr>
           </w:pPr>
-          <w:hyperlink r:id="rId7" w:anchor="_Toc231232077" w:history="1">
+          <w:hyperlink w:anchor="_Toc231233129" w:history="1">
             <w:r>
               <w:rPr>
                 <w:rStyle w:val="Kpr"/>
                 <w:noProof/>
               </w:rPr>
-              <w:t>ADIM 1: Veritabanı Altyapısının Kurulması ve Hazırlık Süreci</w:t>
+              <w:t>ADIM 1: Yüksek Erişilebilirlik ve Yük Dengeleme İletişim Altyapısının Yapılandırılması</w:t>
             </w:r>
             <w:r>
               <w:rPr>
-                <w:rStyle w:val="Kpr"/>
                 <w:noProof/>
                 <w:webHidden/>
-                <w:color w:val="auto"/>
               </w:rPr>
               <w:tab/>
+            </w:r>
+            <w:r>
+              <w:rPr>
+                <w:noProof/>
+                <w:webHidden/>
+              </w:rPr>
+              <w:fldChar w:fldCharType="begin"/>
+            </w:r>
+            <w:r>
+              <w:rPr>
+                <w:noProof/>
+                <w:webHidden/>
+              </w:rPr>
+              <w:instrText xml:space="preserve"> PAGEREF _Toc231233129 \h </w:instrText>
+            </w:r>
+            <w:r>
+              <w:rPr>
+                <w:noProof/>
+                <w:webHidden/>
+              </w:rPr>
+            </w:r>
+            <w:r>
+              <w:rPr>
+                <w:noProof/>
+                <w:webHidden/>
+              </w:rPr>
+              <w:fldChar w:fldCharType="separate"/>
+            </w:r>
+            <w:r>
+              <w:rPr>
+                <w:noProof/>
+                <w:webHidden/>
+              </w:rPr>
               <w:t>3</w:t>
+            </w:r>
+            <w:r>
+              <w:rPr>
+                <w:noProof/>
+                <w:webHidden/>
+              </w:rPr>
+              <w:fldChar w:fldCharType="end"/>
             </w:r>
           </w:hyperlink>
         </w:p>
@@ -497,189 +586,83 @@
               <w:rFonts w:asciiTheme="minorHAnsi" w:eastAsiaTheme="minorEastAsia" w:hAnsiTheme="minorHAnsi" w:cstheme="minorBidi"/>
               <w:b w:val="0"/>
               <w:noProof/>
+              <w:kern w:val="2"/>
               <w:u w:val="none"/>
               <w:lang w:eastAsia="tr-TR"/>
+              <w14:ligatures w14:val="standardContextual"/>
             </w:rPr>
           </w:pPr>
-          <w:hyperlink r:id="rId8" w:anchor="_Toc231232078" w:history="1">
+          <w:hyperlink w:anchor="_Toc231233130" w:history="1">
             <w:r>
               <w:rPr>
                 <w:rStyle w:val="Kpr"/>
                 <w:noProof/>
               </w:rPr>
-              <w:t>ADIM 2: Darboğaz Analizi ve Ağır Sorgu Senaryosu</w:t>
+              <w:t>ADIM 2: Veritabanı Replikasyonu ve Veri Senkronizasyonu Simülasyonu</w:t>
             </w:r>
             <w:r>
               <w:rPr>
-                <w:rStyle w:val="Kpr"/>
                 <w:noProof/>
                 <w:webHidden/>
-                <w:color w:val="auto"/>
               </w:rPr>
               <w:tab/>
+            </w:r>
+            <w:r>
+              <w:rPr>
+                <w:noProof/>
+                <w:webHidden/>
+              </w:rPr>
+              <w:fldChar w:fldCharType="begin"/>
+            </w:r>
+            <w:r>
+              <w:rPr>
+                <w:noProof/>
+                <w:webHidden/>
+              </w:rPr>
+              <w:instrText xml:space="preserve"> PAGEREF _Toc231233130 \h </w:instrText>
+            </w:r>
+            <w:r>
+              <w:rPr>
+                <w:noProof/>
+                <w:webHidden/>
+              </w:rPr>
+            </w:r>
+            <w:r>
+              <w:rPr>
+                <w:noProof/>
+                <w:webHidden/>
+              </w:rPr>
+              <w:fldChar w:fldCharType="separate"/>
+            </w:r>
+            <w:r>
+              <w:rPr>
+                <w:noProof/>
+                <w:webHidden/>
+              </w:rPr>
               <w:t>4</w:t>
+            </w:r>
+            <w:r>
+              <w:rPr>
+                <w:noProof/>
+                <w:webHidden/>
+              </w:rPr>
+              <w:fldChar w:fldCharType="end"/>
             </w:r>
           </w:hyperlink>
         </w:p>
         <w:p>
-          <w:pPr>
-            <w:pStyle w:val="T2"/>
+          <w:r>
             <w:rPr>
-              <w:rFonts w:asciiTheme="minorHAnsi" w:eastAsiaTheme="minorEastAsia" w:hAnsiTheme="minorHAnsi" w:cstheme="minorBidi"/>
-              <w:b w:val="0"/>
-              <w:noProof/>
-              <w:u w:val="none"/>
-              <w:lang w:eastAsia="tr-TR"/>
+              <w:b/>
+              <w:bCs/>
             </w:rPr>
-          </w:pPr>
-          <w:hyperlink r:id="rId9" w:anchor="_Toc231232079" w:history="1">
-            <w:r>
-              <w:rPr>
-                <w:rStyle w:val="Kpr"/>
-                <w:noProof/>
-              </w:rPr>
-              <w:t>ADIM 3: İndeks Yapılandırması ve Performans Optimizasyonu</w:t>
-            </w:r>
-            <w:r>
-              <w:rPr>
-                <w:rStyle w:val="Kpr"/>
-                <w:noProof/>
-                <w:webHidden/>
-                <w:color w:val="auto"/>
-              </w:rPr>
-              <w:tab/>
-              <w:t>5</w:t>
-            </w:r>
-          </w:hyperlink>
+            <w:fldChar w:fldCharType="end"/>
+          </w:r>
         </w:p>
-        <w:p>
-          <w:pPr>
-            <w:pStyle w:val="T2"/>
-            <w:rPr>
-              <w:rFonts w:asciiTheme="minorHAnsi" w:eastAsiaTheme="minorEastAsia" w:hAnsiTheme="minorHAnsi" w:cstheme="minorBidi"/>
-              <w:b w:val="0"/>
-              <w:noProof/>
-              <w:u w:val="none"/>
-              <w:lang w:eastAsia="tr-TR"/>
-            </w:rPr>
-          </w:pPr>
-          <w:hyperlink r:id="rId10" w:anchor="_Toc231232080" w:history="1">
-            <w:r>
-              <w:rPr>
-                <w:rStyle w:val="Kpr"/>
-                <w:noProof/>
-              </w:rPr>
-              <w:t>ADIM 4: Dynamic Management Views (DMV) ile Canlı Performans İzleme</w:t>
-            </w:r>
-            <w:r>
-              <w:rPr>
-                <w:rStyle w:val="Kpr"/>
-                <w:noProof/>
-                <w:webHidden/>
-                <w:color w:val="auto"/>
-              </w:rPr>
-              <w:tab/>
-              <w:t>6</w:t>
-            </w:r>
-          </w:hyperlink>
-        </w:p>
-        <w:p>
-          <w:pPr>
-            <w:pStyle w:val="T2"/>
-            <w:rPr>
-              <w:rFonts w:asciiTheme="minorHAnsi" w:eastAsiaTheme="minorEastAsia" w:hAnsiTheme="minorHAnsi" w:cstheme="minorBidi"/>
-              <w:b w:val="0"/>
-              <w:noProof/>
-              <w:u w:val="none"/>
-              <w:lang w:eastAsia="tr-TR"/>
-            </w:rPr>
-          </w:pPr>
-          <w:hyperlink r:id="rId11" w:anchor="_Toc231232081" w:history="1">
-            <w:r>
-              <w:rPr>
-                <w:rStyle w:val="Kpr"/>
-                <w:noProof/>
-              </w:rPr>
-              <w:t>ADIM 5: Veri Yöneticisi Rolleri ve Erişim Yönetimi</w:t>
-            </w:r>
-            <w:r>
-              <w:rPr>
-                <w:rStyle w:val="Kpr"/>
-                <w:noProof/>
-                <w:webHidden/>
-                <w:color w:val="auto"/>
-              </w:rPr>
-              <w:tab/>
-              <w:t>7</w:t>
-            </w:r>
-          </w:hyperlink>
-        </w:p>
-        <w:p>
-          <w:pPr>
-            <w:pStyle w:val="T2"/>
-            <w:rPr>
-              <w:rFonts w:asciiTheme="minorHAnsi" w:eastAsiaTheme="minorEastAsia" w:hAnsiTheme="minorHAnsi" w:cstheme="minorBidi"/>
-              <w:b w:val="0"/>
-              <w:noProof/>
-              <w:u w:val="none"/>
-              <w:lang w:eastAsia="tr-TR"/>
-            </w:rPr>
-          </w:pPr>
-          <w:hyperlink r:id="rId12" w:anchor="_Toc231232082" w:history="1">
-            <w:r>
-              <w:rPr>
-                <w:rStyle w:val="Kpr"/>
-                <w:noProof/>
-              </w:rPr>
-              <w:t>ADIM 6: Disk Alanı Yönetimi ve Takibi</w:t>
-            </w:r>
-            <w:r>
-              <w:rPr>
-                <w:rStyle w:val="Kpr"/>
-                <w:noProof/>
-                <w:webHidden/>
-                <w:color w:val="auto"/>
-              </w:rPr>
-              <w:tab/>
-              <w:t>7</w:t>
-            </w:r>
-          </w:hyperlink>
-        </w:p>
-        <w:p>
-          <w:pPr>
-            <w:pStyle w:val="T2"/>
-            <w:rPr>
-              <w:rFonts w:asciiTheme="minorHAnsi" w:eastAsiaTheme="minorEastAsia" w:hAnsiTheme="minorHAnsi" w:cstheme="minorBidi"/>
-              <w:b w:val="0"/>
-              <w:noProof/>
-              <w:u w:val="none"/>
-              <w:lang w:eastAsia="tr-TR"/>
-            </w:rPr>
-          </w:pPr>
-          <w:hyperlink r:id="rId13" w:anchor="_Toc231232083" w:history="1">
-            <w:r>
-              <w:rPr>
-                <w:rStyle w:val="Kpr"/>
-                <w:noProof/>
-              </w:rPr>
-              <w:t>Adım 7: Sonuç</w:t>
-            </w:r>
-            <w:r>
-              <w:rPr>
-                <w:rStyle w:val="Kpr"/>
-                <w:noProof/>
-                <w:webHidden/>
-                <w:color w:val="auto"/>
-              </w:rPr>
-              <w:tab/>
-              <w:t>8</w:t>
-            </w:r>
-          </w:hyperlink>
-        </w:p>
-        <w:p/>
       </w:sdtContent>
     </w:sdt>
     <w:p/>
+    <w:p/>
     <w:p>
       <w:pPr>
         <w:pStyle w:val="Balk3"/>
@@ -708,6 +691,7 @@
         <w:pStyle w:val="Balk1"/>
         <w:jc w:val="center"/>
       </w:pPr>
+      <w:bookmarkStart w:id="0" w:name="_Toc231233128"/>
       <w:r>
         <w:lastRenderedPageBreak/>
         <w:t xml:space="preserve">Proje </w:t>
@@ -739,6 +723,7 @@
       <w:r>
         <w:t xml:space="preserve"> Yapıları</w:t>
       </w:r>
+      <w:bookmarkEnd w:id="0"/>
     </w:p>
     <w:p>
       <w:r>
@@ -749,9 +734,11 @@
       <w:pPr>
         <w:pStyle w:val="Balk2"/>
       </w:pPr>
+      <w:bookmarkStart w:id="1" w:name="_Toc231233129"/>
       <w:r>
         <w:t>ADIM 1: Yüksek Erişilebilirlik ve Yük Dengeleme İletişim Altyapısının Yapılandırılması</w:t>
       </w:r>
+      <w:bookmarkEnd w:id="1"/>
     </w:p>
     <w:p>
       <w:r>
@@ -835,6 +822,9 @@
     </w:p>
     <w:p>
       <w:r>
+        <w:rPr>
+          <w:noProof/>
+        </w:rPr>
         <w:drawing>
           <wp:inline distT="0" distB="0" distL="0" distR="0" wp14:anchorId="6C4BE3E8" wp14:editId="617EA192">
             <wp:extent cx="5660898" cy="723900"/>
@@ -851,7 +841,7 @@
                     <pic:cNvPicPr/>
                   </pic:nvPicPr>
                   <pic:blipFill>
-                    <a:blip r:embed="rId14"/>
+                    <a:blip r:embed="rId6"/>
                     <a:stretch>
                       <a:fillRect/>
                     </a:stretch>
@@ -873,6 +863,159 @@
       </w:r>
     </w:p>
     <w:p/>
+    <w:p/>
+    <w:p/>
+    <w:p/>
+    <w:p/>
+    <w:p/>
+    <w:p/>
+    <w:p/>
+    <w:p>
+      <w:r>
+        <w:lastRenderedPageBreak/>
+        <w:t>01.06.2026</w:t>
+      </w:r>
+    </w:p>
+    <w:p>
+      <w:pPr>
+        <w:pStyle w:val="Balk2"/>
+      </w:pPr>
+      <w:bookmarkStart w:id="2" w:name="_Toc231233130"/>
+      <w:r>
+        <w:t xml:space="preserve">ADIM 2: </w:t>
+      </w:r>
+      <w:proofErr w:type="spellStart"/>
+      <w:r>
+        <w:t>Veritabanı</w:t>
+      </w:r>
+      <w:proofErr w:type="spellEnd"/>
+      <w:r>
+        <w:t xml:space="preserve"> Replikasyonu ve Veri Senkronizasyonu Simülasyonu</w:t>
+      </w:r>
+      <w:bookmarkEnd w:id="2"/>
+    </w:p>
+    <w:p>
+      <w:proofErr w:type="spellStart"/>
+      <w:r>
+        <w:t>V</w:t>
+      </w:r>
+      <w:r>
+        <w:t>eritabanı</w:t>
+      </w:r>
+      <w:proofErr w:type="spellEnd"/>
+      <w:r>
+        <w:t xml:space="preserve"> replikasyonu (veri çoğaltma) süreci için sistem üzerinde çalışan dinamik bir senkronizasyon yapısı modellenmiştir. Bu doğrultuda ana </w:t>
+      </w:r>
+      <w:proofErr w:type="spellStart"/>
+      <w:r>
+        <w:t>veritabanındaki</w:t>
+      </w:r>
+      <w:proofErr w:type="spellEnd"/>
+      <w:r>
+        <w:t xml:space="preserve"> verilerin güvenli bir şekilde kopyalanacağı AdventureWorks2019_Replica isimli ikinci bir </w:t>
+      </w:r>
+      <w:proofErr w:type="spellStart"/>
+      <w:r>
+        <w:t>veritabanı</w:t>
+      </w:r>
+      <w:proofErr w:type="spellEnd"/>
+      <w:r>
+        <w:t xml:space="preserve"> katmanı devreye alınmıştır.</w:t>
+      </w:r>
+    </w:p>
+    <w:p>
+      <w:r>
+        <w:t>Replikasyon ve Senkronizasyon Bulguları:</w:t>
+      </w:r>
+    </w:p>
+    <w:p>
+      <w:pPr>
+        <w:numPr>
+          <w:ilvl w:val="0"/>
+          <w:numId w:val="3"/>
+        </w:numPr>
+      </w:pPr>
+      <w:r>
+        <w:t xml:space="preserve">AdventureWorks2019 ana </w:t>
+      </w:r>
+      <w:proofErr w:type="spellStart"/>
+      <w:r>
+        <w:t>veritabanı</w:t>
+      </w:r>
+      <w:proofErr w:type="spellEnd"/>
+      <w:r>
+        <w:t xml:space="preserve"> üzerinde yer alan yoğun veri kümeleri, yazılan T-SQL senkronizasyon mekanizmasıyla replika </w:t>
+      </w:r>
+      <w:proofErr w:type="spellStart"/>
+      <w:r>
+        <w:t>veritabanına</w:t>
+      </w:r>
+      <w:proofErr w:type="spellEnd"/>
+      <w:r>
+        <w:t xml:space="preserve"> başarılı bir şekilde aktarılmıştır.</w:t>
+      </w:r>
+    </w:p>
+    <w:p>
+      <w:pPr>
+        <w:numPr>
+          <w:ilvl w:val="0"/>
+          <w:numId w:val="3"/>
+        </w:numPr>
+      </w:pPr>
+      <w:r>
+        <w:t>Yapılan sorgulama sonucunda, ana tablodaki tüm satırların veri kaybı olmaksızın anlık olarak hedef replika tabloya çoğaltıldığı tespit edilmiştir.</w:t>
+      </w:r>
+    </w:p>
+    <w:p>
+      <w:pPr>
+        <w:numPr>
+          <w:ilvl w:val="0"/>
+          <w:numId w:val="3"/>
+        </w:numPr>
+      </w:pPr>
+      <w:r>
+        <w:t>Bu işlem sayesinde, sunucular arasında veri tutarlılığı güvence altına alınmakta ve yük dengeleme adımları için gerekli olan güncel veri kopyası sürekli hazır tutulmaktadır.</w:t>
+      </w:r>
+    </w:p>
+    <w:p>
+      <w:r>
+        <w:drawing>
+          <wp:inline distT="0" distB="0" distL="0" distR="0" wp14:anchorId="6CFB85B7" wp14:editId="4A7A3542">
+            <wp:extent cx="3444240" cy="944880"/>
+            <wp:effectExtent l="0" t="0" r="3810" b="7620"/>
+            <wp:docPr id="1284484000" name="Resim 1" descr="metin, ekran görüntüsü, yazı tipi, çizgi içeren bir resim&#10;&#10;Yapay zeka tarafından oluşturulmuş içerik yanlış olabilir."/>
+            <wp:cNvGraphicFramePr>
+              <a:graphicFrameLocks xmlns:a="http://schemas.openxmlformats.org/drawingml/2006/main" noChangeAspect="1"/>
+            </wp:cNvGraphicFramePr>
+            <a:graphic xmlns:a="http://schemas.openxmlformats.org/drawingml/2006/main">
+              <a:graphicData uri="http://schemas.openxmlformats.org/drawingml/2006/picture">
+                <pic:pic xmlns:pic="http://schemas.openxmlformats.org/drawingml/2006/picture">
+                  <pic:nvPicPr>
+                    <pic:cNvPr id="1284484000" name="Resim 1" descr="metin, ekran görüntüsü, yazı tipi, çizgi içeren bir resim&#10;&#10;Yapay zeka tarafından oluşturulmuş içerik yanlış olabilir."/>
+                    <pic:cNvPicPr/>
+                  </pic:nvPicPr>
+                  <pic:blipFill>
+                    <a:blip r:embed="rId7"/>
+                    <a:stretch>
+                      <a:fillRect/>
+                    </a:stretch>
+                  </pic:blipFill>
+                  <pic:spPr>
+                    <a:xfrm>
+                      <a:off x="0" y="0"/>
+                      <a:ext cx="3447039" cy="945648"/>
+                    </a:xfrm>
+                    <a:prstGeom prst="rect">
+                      <a:avLst/>
+                    </a:prstGeom>
+                  </pic:spPr>
+                </pic:pic>
+              </a:graphicData>
+            </a:graphic>
+          </wp:inline>
+        </w:drawing>
+      </w:r>
+    </w:p>
     <w:p/>
     <w:sectPr>
       <w:pgSz w:w="11906" w:h="16838"/>
@@ -1184,11 +1327,163 @@
       </w:rPr>
     </w:lvl>
   </w:abstractNum>
+  <w:abstractNum w:abstractNumId="2" w15:restartNumberingAfterBreak="0">
+    <w:nsid w:val="53F477C9"/>
+    <w:multiLevelType w:val="multilevel"/>
+    <w:tmpl w:val="56A44A76"/>
+    <w:lvl w:ilvl="0">
+      <w:start w:val="1"/>
+      <w:numFmt w:val="bullet"/>
+      <w:lvlText w:val=""/>
+      <w:lvlJc w:val="left"/>
+      <w:pPr>
+        <w:tabs>
+          <w:tab w:val="num" w:pos="720"/>
+        </w:tabs>
+        <w:ind w:left="720" w:hanging="360"/>
+      </w:pPr>
+      <w:rPr>
+        <w:rFonts w:ascii="Symbol" w:hAnsi="Symbol" w:hint="default"/>
+        <w:sz w:val="20"/>
+      </w:rPr>
+    </w:lvl>
+    <w:lvl w:ilvl="1" w:tentative="1">
+      <w:start w:val="1"/>
+      <w:numFmt w:val="bullet"/>
+      <w:lvlText w:val="o"/>
+      <w:lvlJc w:val="left"/>
+      <w:pPr>
+        <w:tabs>
+          <w:tab w:val="num" w:pos="1440"/>
+        </w:tabs>
+        <w:ind w:left="1440" w:hanging="360"/>
+      </w:pPr>
+      <w:rPr>
+        <w:rFonts w:ascii="Courier New" w:hAnsi="Courier New" w:hint="default"/>
+        <w:sz w:val="20"/>
+      </w:rPr>
+    </w:lvl>
+    <w:lvl w:ilvl="2" w:tentative="1">
+      <w:start w:val="1"/>
+      <w:numFmt w:val="bullet"/>
+      <w:lvlText w:val=""/>
+      <w:lvlJc w:val="left"/>
+      <w:pPr>
+        <w:tabs>
+          <w:tab w:val="num" w:pos="2160"/>
+        </w:tabs>
+        <w:ind w:left="2160" w:hanging="360"/>
+      </w:pPr>
+      <w:rPr>
+        <w:rFonts w:ascii="Wingdings" w:hAnsi="Wingdings" w:hint="default"/>
+        <w:sz w:val="20"/>
+      </w:rPr>
+    </w:lvl>
+    <w:lvl w:ilvl="3" w:tentative="1">
+      <w:start w:val="1"/>
+      <w:numFmt w:val="bullet"/>
+      <w:lvlText w:val=""/>
+      <w:lvlJc w:val="left"/>
+      <w:pPr>
+        <w:tabs>
+          <w:tab w:val="num" w:pos="2880"/>
+        </w:tabs>
+        <w:ind w:left="2880" w:hanging="360"/>
+      </w:pPr>
+      <w:rPr>
+        <w:rFonts w:ascii="Wingdings" w:hAnsi="Wingdings" w:hint="default"/>
+        <w:sz w:val="20"/>
+      </w:rPr>
+    </w:lvl>
+    <w:lvl w:ilvl="4" w:tentative="1">
+      <w:start w:val="1"/>
+      <w:numFmt w:val="bullet"/>
+      <w:lvlText w:val=""/>
+      <w:lvlJc w:val="left"/>
+      <w:pPr>
+        <w:tabs>
+          <w:tab w:val="num" w:pos="3600"/>
+        </w:tabs>
+        <w:ind w:left="3600" w:hanging="360"/>
+      </w:pPr>
+      <w:rPr>
+        <w:rFonts w:ascii="Wingdings" w:hAnsi="Wingdings" w:hint="default"/>
+        <w:sz w:val="20"/>
+      </w:rPr>
+    </w:lvl>
+    <w:lvl w:ilvl="5" w:tentative="1">
+      <w:start w:val="1"/>
+      <w:numFmt w:val="bullet"/>
+      <w:lvlText w:val=""/>
+      <w:lvlJc w:val="left"/>
+      <w:pPr>
+        <w:tabs>
+          <w:tab w:val="num" w:pos="4320"/>
+        </w:tabs>
+        <w:ind w:left="4320" w:hanging="360"/>
+      </w:pPr>
+      <w:rPr>
+        <w:rFonts w:ascii="Wingdings" w:hAnsi="Wingdings" w:hint="default"/>
+        <w:sz w:val="20"/>
+      </w:rPr>
+    </w:lvl>
+    <w:lvl w:ilvl="6" w:tentative="1">
+      <w:start w:val="1"/>
+      <w:numFmt w:val="bullet"/>
+      <w:lvlText w:val=""/>
+      <w:lvlJc w:val="left"/>
+      <w:pPr>
+        <w:tabs>
+          <w:tab w:val="num" w:pos="5040"/>
+        </w:tabs>
+        <w:ind w:left="5040" w:hanging="360"/>
+      </w:pPr>
+      <w:rPr>
+        <w:rFonts w:ascii="Wingdings" w:hAnsi="Wingdings" w:hint="default"/>
+        <w:sz w:val="20"/>
+      </w:rPr>
+    </w:lvl>
+    <w:lvl w:ilvl="7" w:tentative="1">
+      <w:start w:val="1"/>
+      <w:numFmt w:val="bullet"/>
+      <w:lvlText w:val=""/>
+      <w:lvlJc w:val="left"/>
+      <w:pPr>
+        <w:tabs>
+          <w:tab w:val="num" w:pos="5760"/>
+        </w:tabs>
+        <w:ind w:left="5760" w:hanging="360"/>
+      </w:pPr>
+      <w:rPr>
+        <w:rFonts w:ascii="Wingdings" w:hAnsi="Wingdings" w:hint="default"/>
+        <w:sz w:val="20"/>
+      </w:rPr>
+    </w:lvl>
+    <w:lvl w:ilvl="8" w:tentative="1">
+      <w:start w:val="1"/>
+      <w:numFmt w:val="bullet"/>
+      <w:lvlText w:val=""/>
+      <w:lvlJc w:val="left"/>
+      <w:pPr>
+        <w:tabs>
+          <w:tab w:val="num" w:pos="6480"/>
+        </w:tabs>
+        <w:ind w:left="6480" w:hanging="360"/>
+      </w:pPr>
+      <w:rPr>
+        <w:rFonts w:ascii="Wingdings" w:hAnsi="Wingdings" w:hint="default"/>
+        <w:sz w:val="20"/>
+      </w:rPr>
+    </w:lvl>
+  </w:abstractNum>
   <w:num w:numId="1" w16cid:durableId="9110842">
     <w:abstractNumId w:val="1"/>
   </w:num>
   <w:num w:numId="2" w16cid:durableId="612175472">
     <w:abstractNumId w:val="0"/>
+  </w:num>
+  <w:num w:numId="3" w16cid:durableId="76681063">
+    <w:abstractNumId w:val="2"/>
   </w:num>
 </w:numbering>
 </file>
@@ -2138,7 +2433,6 @@
     <w:next w:val="Normal"/>
     <w:autoRedefine/>
     <w:uiPriority w:val="39"/>
-    <w:semiHidden/>
     <w:unhideWhenUsed/>
     <w:qFormat/>
     <w:rsid w:val="00C340E9"/>
@@ -2160,7 +2454,6 @@
     <w:basedOn w:val="VarsaylanParagrafYazTipi"/>
     <w:link w:val="T2"/>
     <w:uiPriority w:val="39"/>
-    <w:semiHidden/>
     <w:locked/>
     <w:rsid w:val="00C340E9"/>
     <w:rPr>
@@ -2179,7 +2472,6 @@
     <w:link w:val="T2Char"/>
     <w:autoRedefine/>
     <w:uiPriority w:val="39"/>
-    <w:semiHidden/>
     <w:unhideWhenUsed/>
     <w:qFormat/>
     <w:rsid w:val="00C340E9"/>
@@ -2205,7 +2497,6 @@
     <w:basedOn w:val="Balk1"/>
     <w:next w:val="Normal"/>
     <w:uiPriority w:val="39"/>
-    <w:semiHidden/>
     <w:unhideWhenUsed/>
     <w:qFormat/>
     <w:rsid w:val="00C340E9"/>

</xml_diff>

<commit_message>
Proje 4: Failover senaryosu ve yük dengeleme testi başarıyla uygulandı
</commit_message>
<xml_diff>
--- a/BLM4522_Proje4/Proje4_Rapor.docx
+++ b/BLM4522_Proje4/Proje4_Rapor.docx
@@ -450,7 +450,7 @@
           <w:r>
             <w:fldChar w:fldCharType="separate"/>
           </w:r>
-          <w:hyperlink w:anchor="_Toc231233128" w:history="1">
+          <w:hyperlink w:anchor="_Toc231233791" w:history="1">
             <w:r>
               <w:rPr>
                 <w:rStyle w:val="Kpr"/>
@@ -477,7 +477,7 @@
                 <w:noProof/>
                 <w:webHidden/>
               </w:rPr>
-              <w:instrText xml:space="preserve"> PAGEREF _Toc231233128 \h </w:instrText>
+              <w:instrText xml:space="preserve"> PAGEREF _Toc231233791 \h </w:instrText>
             </w:r>
             <w:r>
               <w:rPr>
@@ -521,7 +521,7 @@
               <w14:ligatures w14:val="standardContextual"/>
             </w:rPr>
           </w:pPr>
-          <w:hyperlink w:anchor="_Toc231233129" w:history="1">
+          <w:hyperlink w:anchor="_Toc231233792" w:history="1">
             <w:r>
               <w:rPr>
                 <w:rStyle w:val="Kpr"/>
@@ -548,7 +548,7 @@
                 <w:noProof/>
                 <w:webHidden/>
               </w:rPr>
-              <w:instrText xml:space="preserve"> PAGEREF _Toc231233129 \h </w:instrText>
+              <w:instrText xml:space="preserve"> PAGEREF _Toc231233792 \h </w:instrText>
             </w:r>
             <w:r>
               <w:rPr>
@@ -592,7 +592,7 @@
               <w14:ligatures w14:val="standardContextual"/>
             </w:rPr>
           </w:pPr>
-          <w:hyperlink w:anchor="_Toc231233130" w:history="1">
+          <w:hyperlink w:anchor="_Toc231233793" w:history="1">
             <w:r>
               <w:rPr>
                 <w:rStyle w:val="Kpr"/>
@@ -619,7 +619,78 @@
                 <w:noProof/>
                 <w:webHidden/>
               </w:rPr>
-              <w:instrText xml:space="preserve"> PAGEREF _Toc231233130 \h </w:instrText>
+              <w:instrText xml:space="preserve"> PAGEREF _Toc231233793 \h </w:instrText>
+            </w:r>
+            <w:r>
+              <w:rPr>
+                <w:noProof/>
+                <w:webHidden/>
+              </w:rPr>
+            </w:r>
+            <w:r>
+              <w:rPr>
+                <w:noProof/>
+                <w:webHidden/>
+              </w:rPr>
+              <w:fldChar w:fldCharType="separate"/>
+            </w:r>
+            <w:r>
+              <w:rPr>
+                <w:noProof/>
+                <w:webHidden/>
+              </w:rPr>
+              <w:t>4</w:t>
+            </w:r>
+            <w:r>
+              <w:rPr>
+                <w:noProof/>
+                <w:webHidden/>
+              </w:rPr>
+              <w:fldChar w:fldCharType="end"/>
+            </w:r>
+          </w:hyperlink>
+        </w:p>
+        <w:p>
+          <w:pPr>
+            <w:pStyle w:val="T2"/>
+            <w:rPr>
+              <w:rFonts w:asciiTheme="minorHAnsi" w:eastAsiaTheme="minorEastAsia" w:hAnsiTheme="minorHAnsi" w:cstheme="minorBidi"/>
+              <w:b w:val="0"/>
+              <w:noProof/>
+              <w:kern w:val="2"/>
+              <w:u w:val="none"/>
+              <w:lang w:eastAsia="tr-TR"/>
+              <w14:ligatures w14:val="standardContextual"/>
+            </w:rPr>
+          </w:pPr>
+          <w:hyperlink w:anchor="_Toc231233794" w:history="1">
+            <w:r>
+              <w:rPr>
+                <w:rStyle w:val="Kpr"/>
+                <w:noProof/>
+              </w:rPr>
+              <w:t>ADIM 3: Failover ve Yük Dengeleme Senaryosunun Uygulanması</w:t>
+            </w:r>
+            <w:r>
+              <w:rPr>
+                <w:noProof/>
+                <w:webHidden/>
+              </w:rPr>
+              <w:tab/>
+            </w:r>
+            <w:r>
+              <w:rPr>
+                <w:noProof/>
+                <w:webHidden/>
+              </w:rPr>
+              <w:fldChar w:fldCharType="begin"/>
+            </w:r>
+            <w:r>
+              <w:rPr>
+                <w:noProof/>
+                <w:webHidden/>
+              </w:rPr>
+              <w:instrText xml:space="preserve"> PAGEREF _Toc231233794 \h </w:instrText>
             </w:r>
             <w:r>
               <w:rPr>
@@ -691,7 +762,7 @@
         <w:pStyle w:val="Balk1"/>
         <w:jc w:val="center"/>
       </w:pPr>
-      <w:bookmarkStart w:id="0" w:name="_Toc231233128"/>
+      <w:bookmarkStart w:id="0" w:name="_Toc231233791"/>
       <w:r>
         <w:lastRenderedPageBreak/>
         <w:t xml:space="preserve">Proje </w:t>
@@ -734,7 +805,7 @@
       <w:pPr>
         <w:pStyle w:val="Balk2"/>
       </w:pPr>
-      <w:bookmarkStart w:id="1" w:name="_Toc231233129"/>
+      <w:bookmarkStart w:id="1" w:name="_Toc231233792"/>
       <w:r>
         <w:t>ADIM 1: Yüksek Erişilebilirlik ve Yük Dengeleme İletişim Altyapısının Yapılandırılması</w:t>
       </w:r>
@@ -880,7 +951,7 @@
       <w:pPr>
         <w:pStyle w:val="Balk2"/>
       </w:pPr>
-      <w:bookmarkStart w:id="2" w:name="_Toc231233130"/>
+      <w:bookmarkStart w:id="2" w:name="_Toc231233793"/>
       <w:r>
         <w:t xml:space="preserve">ADIM 2: </w:t>
       </w:r>
@@ -897,14 +968,11 @@
     <w:p>
       <w:proofErr w:type="spellStart"/>
       <w:r>
-        <w:t>V</w:t>
-      </w:r>
-      <w:r>
-        <w:t>eritabanı</w:t>
+        <w:t>Veritabanı</w:t>
       </w:r>
       <w:proofErr w:type="spellEnd"/>
       <w:r>
-        <w:t xml:space="preserve"> replikasyonu (veri çoğaltma) süreci için sistem üzerinde çalışan dinamik bir senkronizasyon yapısı modellenmiştir. Bu doğrultuda ana </w:t>
+        <w:t xml:space="preserve"> replikasyonu (veri çoğaltma) süreci için sistem üzerinde çalışan dinamik bir senkronizasyon yapısı modellenmiştir. Bu doğrultuda, ana kaynak olarak kullanılan AdventureWorks2019 </w:t>
       </w:r>
       <w:proofErr w:type="spellStart"/>
       <w:r>
@@ -932,7 +1000,7 @@
       <w:pPr>
         <w:numPr>
           <w:ilvl w:val="0"/>
-          <w:numId w:val="3"/>
+          <w:numId w:val="4"/>
         </w:numPr>
       </w:pPr>
       <w:r>
@@ -944,7 +1012,7 @@
       </w:r>
       <w:proofErr w:type="spellEnd"/>
       <w:r>
-        <w:t xml:space="preserve"> üzerinde yer alan yoğun veri kümeleri, yazılan T-SQL senkronizasyon mekanizmasıyla replika </w:t>
+        <w:t xml:space="preserve"> üzerinde yer alan yoğun veri kümeleri, yazılan T-SQL senkronizasyon mekanizmasıyla AdventureWorks2019_Replica hedef </w:t>
       </w:r>
       <w:proofErr w:type="spellStart"/>
       <w:r>
@@ -959,7 +1027,7 @@
       <w:pPr>
         <w:numPr>
           <w:ilvl w:val="0"/>
-          <w:numId w:val="3"/>
+          <w:numId w:val="4"/>
         </w:numPr>
       </w:pPr>
       <w:r>
@@ -970,7 +1038,7 @@
       <w:pPr>
         <w:numPr>
           <w:ilvl w:val="0"/>
-          <w:numId w:val="3"/>
+          <w:numId w:val="4"/>
         </w:numPr>
       </w:pPr>
       <w:r>
@@ -979,6 +1047,9 @@
     </w:p>
     <w:p>
       <w:r>
+        <w:rPr>
+          <w:noProof/>
+        </w:rPr>
         <w:drawing>
           <wp:inline distT="0" distB="0" distL="0" distR="0" wp14:anchorId="6CFB85B7" wp14:editId="4A7A3542">
             <wp:extent cx="3444240" cy="944880"/>
@@ -1016,7 +1087,187 @@
         </w:drawing>
       </w:r>
     </w:p>
-    <w:p/>
+    <w:p>
+      <w:r>
+        <w:t xml:space="preserve"> </w:t>
+      </w:r>
+    </w:p>
+    <w:p>
+      <w:r>
+        <w:t>01.06.2026</w:t>
+      </w:r>
+    </w:p>
+    <w:p>
+      <w:pPr>
+        <w:pStyle w:val="Balk2"/>
+      </w:pPr>
+      <w:bookmarkStart w:id="3" w:name="_Toc231233794"/>
+      <w:r>
+        <w:t xml:space="preserve">ADIM 3: </w:t>
+      </w:r>
+      <w:proofErr w:type="spellStart"/>
+      <w:r>
+        <w:t>Failover</w:t>
+      </w:r>
+      <w:proofErr w:type="spellEnd"/>
+      <w:r>
+        <w:t xml:space="preserve"> ve Yük Dengeleme Senaryosunun Uygulanması</w:t>
+      </w:r>
+      <w:bookmarkEnd w:id="3"/>
+    </w:p>
+    <w:p>
+      <w:r>
+        <w:t>B</w:t>
+      </w:r>
+      <w:r>
+        <w:t>aşarısız bir sunucuya geçiş (</w:t>
+      </w:r>
+      <w:proofErr w:type="spellStart"/>
+      <w:r>
+        <w:t>failover</w:t>
+      </w:r>
+      <w:proofErr w:type="spellEnd"/>
+      <w:r>
+        <w:t xml:space="preserve">) stratejilerinin test edilmesi amacıyla sistem üzerinde aktif bir çökme simülasyonu uygulanmaktadır. Bu doğrultuda ana </w:t>
+      </w:r>
+      <w:proofErr w:type="spellStart"/>
+      <w:r>
+        <w:t>veritabanı</w:t>
+      </w:r>
+      <w:proofErr w:type="spellEnd"/>
+      <w:r>
+        <w:t xml:space="preserve"> erişime kapatılarak sistemin yedek mekanizması analiz edilmiştir.</w:t>
+      </w:r>
+    </w:p>
+    <w:p>
+      <w:pPr>
+        <w:rPr>
+          <w:b/>
+          <w:bCs/>
+        </w:rPr>
+      </w:pPr>
+      <w:proofErr w:type="spellStart"/>
+      <w:r>
+        <w:rPr>
+          <w:b/>
+          <w:bCs/>
+        </w:rPr>
+        <w:t>Failover</w:t>
+      </w:r>
+      <w:proofErr w:type="spellEnd"/>
+      <w:r>
+        <w:rPr>
+          <w:b/>
+          <w:bCs/>
+        </w:rPr>
+        <w:t xml:space="preserve"> Test Bulguları:</w:t>
+      </w:r>
+    </w:p>
+    <w:p>
+      <w:pPr>
+        <w:numPr>
+          <w:ilvl w:val="0"/>
+          <w:numId w:val="5"/>
+        </w:numPr>
+      </w:pPr>
+      <w:r>
+        <w:t xml:space="preserve">AdventureWorks2019 ana </w:t>
+      </w:r>
+      <w:proofErr w:type="spellStart"/>
+      <w:r>
+        <w:t>veritabanı</w:t>
+      </w:r>
+      <w:proofErr w:type="spellEnd"/>
+      <w:r>
+        <w:t xml:space="preserve"> OFFLINE moduna getirilerek ana sunucunun tamamen çöktüğü senaryo modellenmiştir.</w:t>
+      </w:r>
+    </w:p>
+    <w:p>
+      <w:pPr>
+        <w:numPr>
+          <w:ilvl w:val="0"/>
+          <w:numId w:val="5"/>
+        </w:numPr>
+      </w:pPr>
+      <w:r>
+        <w:t xml:space="preserve">Ana </w:t>
+      </w:r>
+      <w:proofErr w:type="spellStart"/>
+      <w:r>
+        <w:t>veritabanı</w:t>
+      </w:r>
+      <w:proofErr w:type="spellEnd"/>
+      <w:r>
+        <w:t xml:space="preserve"> erişilemez durumdayken, veri trafiğinin otomatik olarak AdventureWorks2019_Replica </w:t>
+      </w:r>
+      <w:proofErr w:type="spellStart"/>
+      <w:r>
+        <w:t>veritabanına</w:t>
+      </w:r>
+      <w:proofErr w:type="spellEnd"/>
+      <w:r>
+        <w:t xml:space="preserve"> yönlendirildiği ve sorguların kesintisiz şekilde çalışmaya devam ettiği tespit edilmiştir.</w:t>
+      </w:r>
+    </w:p>
+    <w:p>
+      <w:pPr>
+        <w:numPr>
+          <w:ilvl w:val="0"/>
+          <w:numId w:val="5"/>
+        </w:numPr>
+      </w:pPr>
+      <w:r>
+        <w:lastRenderedPageBreak/>
+        <w:t xml:space="preserve">Yapılan bu yük dengeleme ve geçiş testiyle, ana sistemde bir arıza oluşsa dahi dağıtık </w:t>
+      </w:r>
+      <w:proofErr w:type="spellStart"/>
+      <w:r>
+        <w:t>veritabanı</w:t>
+      </w:r>
+      <w:proofErr w:type="spellEnd"/>
+      <w:r>
+        <w:t xml:space="preserve"> mimarisi sayesinde iş sürekliliğinin kayıpsız sağlandığı belirlenmiştir.</w:t>
+      </w:r>
+    </w:p>
+    <w:p>
+      <w:r>
+        <w:drawing>
+          <wp:inline distT="0" distB="0" distL="0" distR="0" wp14:anchorId="03099D55" wp14:editId="1F6A7DCA">
+            <wp:extent cx="3543300" cy="1793705"/>
+            <wp:effectExtent l="0" t="0" r="0" b="0"/>
+            <wp:docPr id="83041441" name="Resim 1" descr="metin, yazı tipi, ekran görüntüsü, sayı, numara içeren bir resim&#10;&#10;Yapay zeka tarafından oluşturulmuş içerik yanlış olabilir."/>
+            <wp:cNvGraphicFramePr>
+              <a:graphicFrameLocks xmlns:a="http://schemas.openxmlformats.org/drawingml/2006/main" noChangeAspect="1"/>
+            </wp:cNvGraphicFramePr>
+            <a:graphic xmlns:a="http://schemas.openxmlformats.org/drawingml/2006/main">
+              <a:graphicData uri="http://schemas.openxmlformats.org/drawingml/2006/picture">
+                <pic:pic xmlns:pic="http://schemas.openxmlformats.org/drawingml/2006/picture">
+                  <pic:nvPicPr>
+                    <pic:cNvPr id="83041441" name="Resim 1" descr="metin, yazı tipi, ekran görüntüsü, sayı, numara içeren bir resim&#10;&#10;Yapay zeka tarafından oluşturulmuş içerik yanlış olabilir."/>
+                    <pic:cNvPicPr/>
+                  </pic:nvPicPr>
+                  <pic:blipFill>
+                    <a:blip r:embed="rId8"/>
+                    <a:stretch>
+                      <a:fillRect/>
+                    </a:stretch>
+                  </pic:blipFill>
+                  <pic:spPr>
+                    <a:xfrm>
+                      <a:off x="0" y="0"/>
+                      <a:ext cx="3558060" cy="1801177"/>
+                    </a:xfrm>
+                    <a:prstGeom prst="rect">
+                      <a:avLst/>
+                    </a:prstGeom>
+                  </pic:spPr>
+                </pic:pic>
+              </a:graphicData>
+            </a:graphic>
+          </wp:inline>
+        </w:drawing>
+      </w:r>
+    </w:p>
     <w:sectPr>
       <w:pgSz w:w="11906" w:h="16838"/>
       <w:pgMar w:top="1417" w:right="1417" w:bottom="1417" w:left="1417" w:header="708" w:footer="708" w:gutter="0"/>
@@ -1179,6 +1430,304 @@
     </w:lvl>
   </w:abstractNum>
   <w:abstractNum w:abstractNumId="1" w15:restartNumberingAfterBreak="0">
+    <w:nsid w:val="47C16E30"/>
+    <w:multiLevelType w:val="multilevel"/>
+    <w:tmpl w:val="F5ECE3FA"/>
+    <w:lvl w:ilvl="0">
+      <w:start w:val="1"/>
+      <w:numFmt w:val="bullet"/>
+      <w:lvlText w:val=""/>
+      <w:lvlJc w:val="left"/>
+      <w:pPr>
+        <w:tabs>
+          <w:tab w:val="num" w:pos="720"/>
+        </w:tabs>
+        <w:ind w:left="720" w:hanging="360"/>
+      </w:pPr>
+      <w:rPr>
+        <w:rFonts w:ascii="Symbol" w:hAnsi="Symbol" w:hint="default"/>
+        <w:sz w:val="20"/>
+      </w:rPr>
+    </w:lvl>
+    <w:lvl w:ilvl="1" w:tentative="1">
+      <w:start w:val="1"/>
+      <w:numFmt w:val="bullet"/>
+      <w:lvlText w:val="o"/>
+      <w:lvlJc w:val="left"/>
+      <w:pPr>
+        <w:tabs>
+          <w:tab w:val="num" w:pos="1440"/>
+        </w:tabs>
+        <w:ind w:left="1440" w:hanging="360"/>
+      </w:pPr>
+      <w:rPr>
+        <w:rFonts w:ascii="Courier New" w:hAnsi="Courier New" w:hint="default"/>
+        <w:sz w:val="20"/>
+      </w:rPr>
+    </w:lvl>
+    <w:lvl w:ilvl="2" w:tentative="1">
+      <w:start w:val="1"/>
+      <w:numFmt w:val="bullet"/>
+      <w:lvlText w:val=""/>
+      <w:lvlJc w:val="left"/>
+      <w:pPr>
+        <w:tabs>
+          <w:tab w:val="num" w:pos="2160"/>
+        </w:tabs>
+        <w:ind w:left="2160" w:hanging="360"/>
+      </w:pPr>
+      <w:rPr>
+        <w:rFonts w:ascii="Wingdings" w:hAnsi="Wingdings" w:hint="default"/>
+        <w:sz w:val="20"/>
+      </w:rPr>
+    </w:lvl>
+    <w:lvl w:ilvl="3" w:tentative="1">
+      <w:start w:val="1"/>
+      <w:numFmt w:val="bullet"/>
+      <w:lvlText w:val=""/>
+      <w:lvlJc w:val="left"/>
+      <w:pPr>
+        <w:tabs>
+          <w:tab w:val="num" w:pos="2880"/>
+        </w:tabs>
+        <w:ind w:left="2880" w:hanging="360"/>
+      </w:pPr>
+      <w:rPr>
+        <w:rFonts w:ascii="Wingdings" w:hAnsi="Wingdings" w:hint="default"/>
+        <w:sz w:val="20"/>
+      </w:rPr>
+    </w:lvl>
+    <w:lvl w:ilvl="4" w:tentative="1">
+      <w:start w:val="1"/>
+      <w:numFmt w:val="bullet"/>
+      <w:lvlText w:val=""/>
+      <w:lvlJc w:val="left"/>
+      <w:pPr>
+        <w:tabs>
+          <w:tab w:val="num" w:pos="3600"/>
+        </w:tabs>
+        <w:ind w:left="3600" w:hanging="360"/>
+      </w:pPr>
+      <w:rPr>
+        <w:rFonts w:ascii="Wingdings" w:hAnsi="Wingdings" w:hint="default"/>
+        <w:sz w:val="20"/>
+      </w:rPr>
+    </w:lvl>
+    <w:lvl w:ilvl="5" w:tentative="1">
+      <w:start w:val="1"/>
+      <w:numFmt w:val="bullet"/>
+      <w:lvlText w:val=""/>
+      <w:lvlJc w:val="left"/>
+      <w:pPr>
+        <w:tabs>
+          <w:tab w:val="num" w:pos="4320"/>
+        </w:tabs>
+        <w:ind w:left="4320" w:hanging="360"/>
+      </w:pPr>
+      <w:rPr>
+        <w:rFonts w:ascii="Wingdings" w:hAnsi="Wingdings" w:hint="default"/>
+        <w:sz w:val="20"/>
+      </w:rPr>
+    </w:lvl>
+    <w:lvl w:ilvl="6" w:tentative="1">
+      <w:start w:val="1"/>
+      <w:numFmt w:val="bullet"/>
+      <w:lvlText w:val=""/>
+      <w:lvlJc w:val="left"/>
+      <w:pPr>
+        <w:tabs>
+          <w:tab w:val="num" w:pos="5040"/>
+        </w:tabs>
+        <w:ind w:left="5040" w:hanging="360"/>
+      </w:pPr>
+      <w:rPr>
+        <w:rFonts w:ascii="Wingdings" w:hAnsi="Wingdings" w:hint="default"/>
+        <w:sz w:val="20"/>
+      </w:rPr>
+    </w:lvl>
+    <w:lvl w:ilvl="7" w:tentative="1">
+      <w:start w:val="1"/>
+      <w:numFmt w:val="bullet"/>
+      <w:lvlText w:val=""/>
+      <w:lvlJc w:val="left"/>
+      <w:pPr>
+        <w:tabs>
+          <w:tab w:val="num" w:pos="5760"/>
+        </w:tabs>
+        <w:ind w:left="5760" w:hanging="360"/>
+      </w:pPr>
+      <w:rPr>
+        <w:rFonts w:ascii="Wingdings" w:hAnsi="Wingdings" w:hint="default"/>
+        <w:sz w:val="20"/>
+      </w:rPr>
+    </w:lvl>
+    <w:lvl w:ilvl="8" w:tentative="1">
+      <w:start w:val="1"/>
+      <w:numFmt w:val="bullet"/>
+      <w:lvlText w:val=""/>
+      <w:lvlJc w:val="left"/>
+      <w:pPr>
+        <w:tabs>
+          <w:tab w:val="num" w:pos="6480"/>
+        </w:tabs>
+        <w:ind w:left="6480" w:hanging="360"/>
+      </w:pPr>
+      <w:rPr>
+        <w:rFonts w:ascii="Wingdings" w:hAnsi="Wingdings" w:hint="default"/>
+        <w:sz w:val="20"/>
+      </w:rPr>
+    </w:lvl>
+  </w:abstractNum>
+  <w:abstractNum w:abstractNumId="2" w15:restartNumberingAfterBreak="0">
+    <w:nsid w:val="4AA44615"/>
+    <w:multiLevelType w:val="multilevel"/>
+    <w:tmpl w:val="AB5A4BA6"/>
+    <w:lvl w:ilvl="0">
+      <w:start w:val="1"/>
+      <w:numFmt w:val="bullet"/>
+      <w:lvlText w:val=""/>
+      <w:lvlJc w:val="left"/>
+      <w:pPr>
+        <w:tabs>
+          <w:tab w:val="num" w:pos="720"/>
+        </w:tabs>
+        <w:ind w:left="720" w:hanging="360"/>
+      </w:pPr>
+      <w:rPr>
+        <w:rFonts w:ascii="Symbol" w:hAnsi="Symbol" w:hint="default"/>
+        <w:sz w:val="20"/>
+      </w:rPr>
+    </w:lvl>
+    <w:lvl w:ilvl="1" w:tentative="1">
+      <w:start w:val="1"/>
+      <w:numFmt w:val="bullet"/>
+      <w:lvlText w:val="o"/>
+      <w:lvlJc w:val="left"/>
+      <w:pPr>
+        <w:tabs>
+          <w:tab w:val="num" w:pos="1440"/>
+        </w:tabs>
+        <w:ind w:left="1440" w:hanging="360"/>
+      </w:pPr>
+      <w:rPr>
+        <w:rFonts w:ascii="Courier New" w:hAnsi="Courier New" w:hint="default"/>
+        <w:sz w:val="20"/>
+      </w:rPr>
+    </w:lvl>
+    <w:lvl w:ilvl="2" w:tentative="1">
+      <w:start w:val="1"/>
+      <w:numFmt w:val="bullet"/>
+      <w:lvlText w:val=""/>
+      <w:lvlJc w:val="left"/>
+      <w:pPr>
+        <w:tabs>
+          <w:tab w:val="num" w:pos="2160"/>
+        </w:tabs>
+        <w:ind w:left="2160" w:hanging="360"/>
+      </w:pPr>
+      <w:rPr>
+        <w:rFonts w:ascii="Wingdings" w:hAnsi="Wingdings" w:hint="default"/>
+        <w:sz w:val="20"/>
+      </w:rPr>
+    </w:lvl>
+    <w:lvl w:ilvl="3" w:tentative="1">
+      <w:start w:val="1"/>
+      <w:numFmt w:val="bullet"/>
+      <w:lvlText w:val=""/>
+      <w:lvlJc w:val="left"/>
+      <w:pPr>
+        <w:tabs>
+          <w:tab w:val="num" w:pos="2880"/>
+        </w:tabs>
+        <w:ind w:left="2880" w:hanging="360"/>
+      </w:pPr>
+      <w:rPr>
+        <w:rFonts w:ascii="Wingdings" w:hAnsi="Wingdings" w:hint="default"/>
+        <w:sz w:val="20"/>
+      </w:rPr>
+    </w:lvl>
+    <w:lvl w:ilvl="4" w:tentative="1">
+      <w:start w:val="1"/>
+      <w:numFmt w:val="bullet"/>
+      <w:lvlText w:val=""/>
+      <w:lvlJc w:val="left"/>
+      <w:pPr>
+        <w:tabs>
+          <w:tab w:val="num" w:pos="3600"/>
+        </w:tabs>
+        <w:ind w:left="3600" w:hanging="360"/>
+      </w:pPr>
+      <w:rPr>
+        <w:rFonts w:ascii="Wingdings" w:hAnsi="Wingdings" w:hint="default"/>
+        <w:sz w:val="20"/>
+      </w:rPr>
+    </w:lvl>
+    <w:lvl w:ilvl="5" w:tentative="1">
+      <w:start w:val="1"/>
+      <w:numFmt w:val="bullet"/>
+      <w:lvlText w:val=""/>
+      <w:lvlJc w:val="left"/>
+      <w:pPr>
+        <w:tabs>
+          <w:tab w:val="num" w:pos="4320"/>
+        </w:tabs>
+        <w:ind w:left="4320" w:hanging="360"/>
+      </w:pPr>
+      <w:rPr>
+        <w:rFonts w:ascii="Wingdings" w:hAnsi="Wingdings" w:hint="default"/>
+        <w:sz w:val="20"/>
+      </w:rPr>
+    </w:lvl>
+    <w:lvl w:ilvl="6" w:tentative="1">
+      <w:start w:val="1"/>
+      <w:numFmt w:val="bullet"/>
+      <w:lvlText w:val=""/>
+      <w:lvlJc w:val="left"/>
+      <w:pPr>
+        <w:tabs>
+          <w:tab w:val="num" w:pos="5040"/>
+        </w:tabs>
+        <w:ind w:left="5040" w:hanging="360"/>
+      </w:pPr>
+      <w:rPr>
+        <w:rFonts w:ascii="Wingdings" w:hAnsi="Wingdings" w:hint="default"/>
+        <w:sz w:val="20"/>
+      </w:rPr>
+    </w:lvl>
+    <w:lvl w:ilvl="7" w:tentative="1">
+      <w:start w:val="1"/>
+      <w:numFmt w:val="bullet"/>
+      <w:lvlText w:val=""/>
+      <w:lvlJc w:val="left"/>
+      <w:pPr>
+        <w:tabs>
+          <w:tab w:val="num" w:pos="5760"/>
+        </w:tabs>
+        <w:ind w:left="5760" w:hanging="360"/>
+      </w:pPr>
+      <w:rPr>
+        <w:rFonts w:ascii="Wingdings" w:hAnsi="Wingdings" w:hint="default"/>
+        <w:sz w:val="20"/>
+      </w:rPr>
+    </w:lvl>
+    <w:lvl w:ilvl="8" w:tentative="1">
+      <w:start w:val="1"/>
+      <w:numFmt w:val="bullet"/>
+      <w:lvlText w:val=""/>
+      <w:lvlJc w:val="left"/>
+      <w:pPr>
+        <w:tabs>
+          <w:tab w:val="num" w:pos="6480"/>
+        </w:tabs>
+        <w:ind w:left="6480" w:hanging="360"/>
+      </w:pPr>
+      <w:rPr>
+        <w:rFonts w:ascii="Wingdings" w:hAnsi="Wingdings" w:hint="default"/>
+        <w:sz w:val="20"/>
+      </w:rPr>
+    </w:lvl>
+  </w:abstractNum>
+  <w:abstractNum w:abstractNumId="3" w15:restartNumberingAfterBreak="0">
     <w:nsid w:val="526E1E29"/>
     <w:multiLevelType w:val="multilevel"/>
     <w:tmpl w:val="9066FC7E"/>
@@ -1327,7 +1876,7 @@
       </w:rPr>
     </w:lvl>
   </w:abstractNum>
-  <w:abstractNum w:abstractNumId="2" w15:restartNumberingAfterBreak="0">
+  <w:abstractNum w:abstractNumId="4" w15:restartNumberingAfterBreak="0">
     <w:nsid w:val="53F477C9"/>
     <w:multiLevelType w:val="multilevel"/>
     <w:tmpl w:val="56A44A76"/>
@@ -1477,13 +2026,19 @@
     </w:lvl>
   </w:abstractNum>
   <w:num w:numId="1" w16cid:durableId="9110842">
-    <w:abstractNumId w:val="1"/>
+    <w:abstractNumId w:val="3"/>
   </w:num>
   <w:num w:numId="2" w16cid:durableId="612175472">
     <w:abstractNumId w:val="0"/>
   </w:num>
   <w:num w:numId="3" w16cid:durableId="76681063">
+    <w:abstractNumId w:val="4"/>
+  </w:num>
+  <w:num w:numId="4" w16cid:durableId="1447119027">
     <w:abstractNumId w:val="2"/>
+  </w:num>
+  <w:num w:numId="5" w16cid:durableId="940525626">
+    <w:abstractNumId w:val="1"/>
   </w:num>
 </w:numbering>
 </file>

</xml_diff>

<commit_message>
Proje 4: Dinamik yük dengeleyici kodları eklendi.
</commit_message>
<xml_diff>
--- a/BLM4522_Proje4/Proje4_Rapor.docx
+++ b/BLM4522_Proje4/Proje4_Rapor.docx
@@ -450,7 +450,7 @@
           <w:r>
             <w:fldChar w:fldCharType="separate"/>
           </w:r>
-          <w:hyperlink w:anchor="_Toc231233791" w:history="1">
+          <w:hyperlink w:anchor="_Toc231234659" w:history="1">
             <w:r>
               <w:rPr>
                 <w:rStyle w:val="Kpr"/>
@@ -477,7 +477,7 @@
                 <w:noProof/>
                 <w:webHidden/>
               </w:rPr>
-              <w:instrText xml:space="preserve"> PAGEREF _Toc231233791 \h </w:instrText>
+              <w:instrText xml:space="preserve"> PAGEREF _Toc231234659 \h </w:instrText>
             </w:r>
             <w:r>
               <w:rPr>
@@ -521,7 +521,7 @@
               <w14:ligatures w14:val="standardContextual"/>
             </w:rPr>
           </w:pPr>
-          <w:hyperlink w:anchor="_Toc231233792" w:history="1">
+          <w:hyperlink w:anchor="_Toc231234660" w:history="1">
             <w:r>
               <w:rPr>
                 <w:rStyle w:val="Kpr"/>
@@ -548,7 +548,7 @@
                 <w:noProof/>
                 <w:webHidden/>
               </w:rPr>
-              <w:instrText xml:space="preserve"> PAGEREF _Toc231233792 \h </w:instrText>
+              <w:instrText xml:space="preserve"> PAGEREF _Toc231234660 \h </w:instrText>
             </w:r>
             <w:r>
               <w:rPr>
@@ -592,7 +592,7 @@
               <w14:ligatures w14:val="standardContextual"/>
             </w:rPr>
           </w:pPr>
-          <w:hyperlink w:anchor="_Toc231233793" w:history="1">
+          <w:hyperlink w:anchor="_Toc231234661" w:history="1">
             <w:r>
               <w:rPr>
                 <w:rStyle w:val="Kpr"/>
@@ -619,7 +619,7 @@
                 <w:noProof/>
                 <w:webHidden/>
               </w:rPr>
-              <w:instrText xml:space="preserve"> PAGEREF _Toc231233793 \h </w:instrText>
+              <w:instrText xml:space="preserve"> PAGEREF _Toc231234661 \h </w:instrText>
             </w:r>
             <w:r>
               <w:rPr>
@@ -663,7 +663,7 @@
               <w14:ligatures w14:val="standardContextual"/>
             </w:rPr>
           </w:pPr>
-          <w:hyperlink w:anchor="_Toc231233794" w:history="1">
+          <w:hyperlink w:anchor="_Toc231234662" w:history="1">
             <w:r>
               <w:rPr>
                 <w:rStyle w:val="Kpr"/>
@@ -690,7 +690,7 @@
                 <w:noProof/>
                 <w:webHidden/>
               </w:rPr>
-              <w:instrText xml:space="preserve"> PAGEREF _Toc231233794 \h </w:instrText>
+              <w:instrText xml:space="preserve"> PAGEREF _Toc231234662 \h </w:instrText>
             </w:r>
             <w:r>
               <w:rPr>
@@ -711,6 +711,77 @@
                 <w:webHidden/>
               </w:rPr>
               <w:t>4</w:t>
+            </w:r>
+            <w:r>
+              <w:rPr>
+                <w:noProof/>
+                <w:webHidden/>
+              </w:rPr>
+              <w:fldChar w:fldCharType="end"/>
+            </w:r>
+          </w:hyperlink>
+        </w:p>
+        <w:p>
+          <w:pPr>
+            <w:pStyle w:val="T2"/>
+            <w:rPr>
+              <w:rFonts w:asciiTheme="minorHAnsi" w:eastAsiaTheme="minorEastAsia" w:hAnsiTheme="minorHAnsi" w:cstheme="minorBidi"/>
+              <w:b w:val="0"/>
+              <w:noProof/>
+              <w:kern w:val="2"/>
+              <w:u w:val="none"/>
+              <w:lang w:eastAsia="tr-TR"/>
+              <w14:ligatures w14:val="standardContextual"/>
+            </w:rPr>
+          </w:pPr>
+          <w:hyperlink w:anchor="_Toc231234663" w:history="1">
+            <w:r>
+              <w:rPr>
+                <w:rStyle w:val="Kpr"/>
+                <w:noProof/>
+              </w:rPr>
+              <w:t>ADIM 4: Dinamik Yük Dengeleyici (Load Balancer Router) Tasarımı</w:t>
+            </w:r>
+            <w:r>
+              <w:rPr>
+                <w:noProof/>
+                <w:webHidden/>
+              </w:rPr>
+              <w:tab/>
+            </w:r>
+            <w:r>
+              <w:rPr>
+                <w:noProof/>
+                <w:webHidden/>
+              </w:rPr>
+              <w:fldChar w:fldCharType="begin"/>
+            </w:r>
+            <w:r>
+              <w:rPr>
+                <w:noProof/>
+                <w:webHidden/>
+              </w:rPr>
+              <w:instrText xml:space="preserve"> PAGEREF _Toc231234663 \h </w:instrText>
+            </w:r>
+            <w:r>
+              <w:rPr>
+                <w:noProof/>
+                <w:webHidden/>
+              </w:rPr>
+            </w:r>
+            <w:r>
+              <w:rPr>
+                <w:noProof/>
+                <w:webHidden/>
+              </w:rPr>
+              <w:fldChar w:fldCharType="separate"/>
+            </w:r>
+            <w:r>
+              <w:rPr>
+                <w:noProof/>
+                <w:webHidden/>
+              </w:rPr>
+              <w:t>5</w:t>
             </w:r>
             <w:r>
               <w:rPr>
@@ -762,7 +833,7 @@
         <w:pStyle w:val="Balk1"/>
         <w:jc w:val="center"/>
       </w:pPr>
-      <w:bookmarkStart w:id="0" w:name="_Toc231233791"/>
+      <w:bookmarkStart w:id="0" w:name="_Toc231234659"/>
       <w:r>
         <w:lastRenderedPageBreak/>
         <w:t xml:space="preserve">Proje </w:t>
@@ -805,7 +876,7 @@
       <w:pPr>
         <w:pStyle w:val="Balk2"/>
       </w:pPr>
-      <w:bookmarkStart w:id="1" w:name="_Toc231233792"/>
+      <w:bookmarkStart w:id="1" w:name="_Toc231234660"/>
       <w:r>
         <w:t>ADIM 1: Yüksek Erişilebilirlik ve Yük Dengeleme İletişim Altyapısının Yapılandırılması</w:t>
       </w:r>
@@ -951,7 +1022,7 @@
       <w:pPr>
         <w:pStyle w:val="Balk2"/>
       </w:pPr>
-      <w:bookmarkStart w:id="2" w:name="_Toc231233793"/>
+      <w:bookmarkStart w:id="2" w:name="_Toc231234661"/>
       <w:r>
         <w:t xml:space="preserve">ADIM 2: </w:t>
       </w:r>
@@ -1101,7 +1172,7 @@
       <w:pPr>
         <w:pStyle w:val="Balk2"/>
       </w:pPr>
-      <w:bookmarkStart w:id="3" w:name="_Toc231233794"/>
+      <w:bookmarkStart w:id="3" w:name="_Toc231234662"/>
       <w:r>
         <w:t xml:space="preserve">ADIM 3: </w:t>
       </w:r>
@@ -1117,10 +1188,7 @@
     </w:p>
     <w:p>
       <w:r>
-        <w:t>B</w:t>
-      </w:r>
-      <w:r>
-        <w:t>aşarısız bir sunucuya geçiş (</w:t>
+        <w:t>Başarısız bir sunucuya geçiş (</w:t>
       </w:r>
       <w:proofErr w:type="spellStart"/>
       <w:r>
@@ -1231,6 +1299,9 @@
     </w:p>
     <w:p>
       <w:r>
+        <w:rPr>
+          <w:noProof/>
+        </w:rPr>
         <w:drawing>
           <wp:inline distT="0" distB="0" distL="0" distR="0" wp14:anchorId="03099D55" wp14:editId="1F6A7DCA">
             <wp:extent cx="3543300" cy="1793705"/>
@@ -1268,6 +1339,199 @@
         </w:drawing>
       </w:r>
     </w:p>
+    <w:p/>
+    <w:p>
+      <w:r>
+        <w:t>01.06.2026</w:t>
+      </w:r>
+    </w:p>
+    <w:p>
+      <w:pPr>
+        <w:pStyle w:val="Balk2"/>
+      </w:pPr>
+      <w:bookmarkStart w:id="4" w:name="_Toc231234663"/>
+      <w:r>
+        <w:t>ADIM 4: Dinamik Yük Dengeleyici (</w:t>
+      </w:r>
+      <w:proofErr w:type="spellStart"/>
+      <w:r>
+        <w:t>Load</w:t>
+      </w:r>
+      <w:proofErr w:type="spellEnd"/>
+      <w:r>
+        <w:t xml:space="preserve"> </w:t>
+      </w:r>
+      <w:proofErr w:type="spellStart"/>
+      <w:r>
+        <w:t>Balancer</w:t>
+      </w:r>
+      <w:proofErr w:type="spellEnd"/>
+      <w:r>
+        <w:t xml:space="preserve"> </w:t>
+      </w:r>
+      <w:proofErr w:type="spellStart"/>
+      <w:r>
+        <w:t>Router</w:t>
+      </w:r>
+      <w:proofErr w:type="spellEnd"/>
+      <w:r>
+        <w:t>) Tasarımı</w:t>
+      </w:r>
+      <w:bookmarkEnd w:id="4"/>
+    </w:p>
+    <w:p>
+      <w:r>
+        <w:t>Y</w:t>
+      </w:r>
+      <w:r>
+        <w:t xml:space="preserve">ük dengeleme stratejilerinin yazılımsal olarak modellenmesi amacıyla, kurumsal mimarilerde kullanılan </w:t>
+      </w:r>
+      <w:r>
+        <w:rPr>
+          <w:i/>
+          <w:iCs/>
+        </w:rPr>
+        <w:t xml:space="preserve">Read/Write </w:t>
+      </w:r>
+      <w:proofErr w:type="spellStart"/>
+      <w:r>
+        <w:rPr>
+          <w:i/>
+          <w:iCs/>
+        </w:rPr>
+        <w:t>Splitter</w:t>
+      </w:r>
+      <w:proofErr w:type="spellEnd"/>
+      <w:r>
+        <w:t xml:space="preserve"> mekanizması T-SQL tabanlı programlanmıştır. Bu doğrultuda, sisteme gelen sorgunun niteliğine göre </w:t>
+      </w:r>
+      <w:proofErr w:type="spellStart"/>
+      <w:r>
+        <w:t>veritabanı</w:t>
+      </w:r>
+      <w:proofErr w:type="spellEnd"/>
+      <w:r>
+        <w:t xml:space="preserve"> yükünü paylaştıran dinamik bir </w:t>
+      </w:r>
+      <w:proofErr w:type="spellStart"/>
+      <w:r>
+        <w:t>sp_DatabaseLoadBalancer</w:t>
+      </w:r>
+      <w:proofErr w:type="spellEnd"/>
+      <w:r>
+        <w:t xml:space="preserve"> saklı yordamı (</w:t>
+      </w:r>
+      <w:proofErr w:type="spellStart"/>
+      <w:r>
+        <w:t>Stored</w:t>
+      </w:r>
+      <w:proofErr w:type="spellEnd"/>
+      <w:r>
+        <w:t xml:space="preserve"> </w:t>
+      </w:r>
+      <w:proofErr w:type="spellStart"/>
+      <w:r>
+        <w:t>Procedure</w:t>
+      </w:r>
+      <w:proofErr w:type="spellEnd"/>
+      <w:r>
+        <w:t>) geliştirilmiştir.</w:t>
+      </w:r>
+    </w:p>
+    <w:p>
+      <w:r>
+        <w:t>Yük Dengeleme Bulguları:</w:t>
+      </w:r>
+    </w:p>
+    <w:p>
+      <w:pPr>
+        <w:numPr>
+          <w:ilvl w:val="0"/>
+          <w:numId w:val="6"/>
+        </w:numPr>
+      </w:pPr>
+      <w:r>
+        <w:t xml:space="preserve">Sisteme gelen yoğun okuma (READ) taleplerinin otomatik olarak ana sunucudan alınarak AdventureWorks2019_Replica </w:t>
+      </w:r>
+      <w:proofErr w:type="spellStart"/>
+      <w:r>
+        <w:t>veritabanına</w:t>
+      </w:r>
+      <w:proofErr w:type="spellEnd"/>
+      <w:r>
+        <w:t xml:space="preserve"> yönlendirildiği tespit edilmiştir.</w:t>
+      </w:r>
+    </w:p>
+    <w:p>
+      <w:pPr>
+        <w:numPr>
+          <w:ilvl w:val="0"/>
+          <w:numId w:val="6"/>
+        </w:numPr>
+      </w:pPr>
+      <w:r>
+        <w:t xml:space="preserve">Veri ekleme veya güncelleme gibi yazma taleplerinin ise doğrudan ana AdventureWorks2019 </w:t>
+      </w:r>
+      <w:proofErr w:type="spellStart"/>
+      <w:r>
+        <w:t>veritabanında</w:t>
+      </w:r>
+      <w:proofErr w:type="spellEnd"/>
+      <w:r>
+        <w:t xml:space="preserve"> işlenmesi sağlanarak sunucular arası yük dağıtımı optimize edilmektedir.</w:t>
+      </w:r>
+    </w:p>
+    <w:p>
+      <w:pPr>
+        <w:numPr>
+          <w:ilvl w:val="0"/>
+          <w:numId w:val="6"/>
+        </w:numPr>
+      </w:pPr>
+      <w:r>
+        <w:t>Geliştirilen bu algoritma sayesinde, ana sunucu üzerindeki işlemci (CPU) ve disk log yükü azaltılmakta ve dağıtık mimaride maksimum performans elde edilmektedir.</w:t>
+      </w:r>
+    </w:p>
+    <w:p>
+      <w:r>
+        <w:drawing>
+          <wp:inline distT="0" distB="0" distL="0" distR="0" wp14:anchorId="29B818B2" wp14:editId="683426FE">
+            <wp:extent cx="5760720" cy="1389380"/>
+            <wp:effectExtent l="0" t="0" r="0" b="1270"/>
+            <wp:docPr id="7314513" name="Resim 1"/>
+            <wp:cNvGraphicFramePr>
+              <a:graphicFrameLocks xmlns:a="http://schemas.openxmlformats.org/drawingml/2006/main" noChangeAspect="1"/>
+            </wp:cNvGraphicFramePr>
+            <a:graphic xmlns:a="http://schemas.openxmlformats.org/drawingml/2006/main">
+              <a:graphicData uri="http://schemas.openxmlformats.org/drawingml/2006/picture">
+                <pic:pic xmlns:pic="http://schemas.openxmlformats.org/drawingml/2006/picture">
+                  <pic:nvPicPr>
+                    <pic:cNvPr id="7314513" name=""/>
+                    <pic:cNvPicPr/>
+                  </pic:nvPicPr>
+                  <pic:blipFill>
+                    <a:blip r:embed="rId9"/>
+                    <a:stretch>
+                      <a:fillRect/>
+                    </a:stretch>
+                  </pic:blipFill>
+                  <pic:spPr>
+                    <a:xfrm>
+                      <a:off x="0" y="0"/>
+                      <a:ext cx="5760720" cy="1389380"/>
+                    </a:xfrm>
+                    <a:prstGeom prst="rect">
+                      <a:avLst/>
+                    </a:prstGeom>
+                  </pic:spPr>
+                </pic:pic>
+              </a:graphicData>
+            </a:graphic>
+          </wp:inline>
+        </w:drawing>
+      </w:r>
+    </w:p>
+    <w:p/>
     <w:sectPr>
       <w:pgSz w:w="11906" w:h="16838"/>
       <w:pgMar w:top="1417" w:right="1417" w:bottom="1417" w:left="1417" w:header="708" w:footer="708" w:gutter="0"/>
@@ -2025,6 +2289,155 @@
       </w:rPr>
     </w:lvl>
   </w:abstractNum>
+  <w:abstractNum w:abstractNumId="5" w15:restartNumberingAfterBreak="0">
+    <w:nsid w:val="764C09D5"/>
+    <w:multiLevelType w:val="multilevel"/>
+    <w:tmpl w:val="A15836E6"/>
+    <w:lvl w:ilvl="0">
+      <w:start w:val="1"/>
+      <w:numFmt w:val="bullet"/>
+      <w:lvlText w:val=""/>
+      <w:lvlJc w:val="left"/>
+      <w:pPr>
+        <w:tabs>
+          <w:tab w:val="num" w:pos="720"/>
+        </w:tabs>
+        <w:ind w:left="720" w:hanging="360"/>
+      </w:pPr>
+      <w:rPr>
+        <w:rFonts w:ascii="Symbol" w:hAnsi="Symbol" w:hint="default"/>
+        <w:sz w:val="20"/>
+      </w:rPr>
+    </w:lvl>
+    <w:lvl w:ilvl="1" w:tentative="1">
+      <w:start w:val="1"/>
+      <w:numFmt w:val="bullet"/>
+      <w:lvlText w:val="o"/>
+      <w:lvlJc w:val="left"/>
+      <w:pPr>
+        <w:tabs>
+          <w:tab w:val="num" w:pos="1440"/>
+        </w:tabs>
+        <w:ind w:left="1440" w:hanging="360"/>
+      </w:pPr>
+      <w:rPr>
+        <w:rFonts w:ascii="Courier New" w:hAnsi="Courier New" w:hint="default"/>
+        <w:sz w:val="20"/>
+      </w:rPr>
+    </w:lvl>
+    <w:lvl w:ilvl="2" w:tentative="1">
+      <w:start w:val="1"/>
+      <w:numFmt w:val="bullet"/>
+      <w:lvlText w:val=""/>
+      <w:lvlJc w:val="left"/>
+      <w:pPr>
+        <w:tabs>
+          <w:tab w:val="num" w:pos="2160"/>
+        </w:tabs>
+        <w:ind w:left="2160" w:hanging="360"/>
+      </w:pPr>
+      <w:rPr>
+        <w:rFonts w:ascii="Wingdings" w:hAnsi="Wingdings" w:hint="default"/>
+        <w:sz w:val="20"/>
+      </w:rPr>
+    </w:lvl>
+    <w:lvl w:ilvl="3" w:tentative="1">
+      <w:start w:val="1"/>
+      <w:numFmt w:val="bullet"/>
+      <w:lvlText w:val=""/>
+      <w:lvlJc w:val="left"/>
+      <w:pPr>
+        <w:tabs>
+          <w:tab w:val="num" w:pos="2880"/>
+        </w:tabs>
+        <w:ind w:left="2880" w:hanging="360"/>
+      </w:pPr>
+      <w:rPr>
+        <w:rFonts w:ascii="Wingdings" w:hAnsi="Wingdings" w:hint="default"/>
+        <w:sz w:val="20"/>
+      </w:rPr>
+    </w:lvl>
+    <w:lvl w:ilvl="4" w:tentative="1">
+      <w:start w:val="1"/>
+      <w:numFmt w:val="bullet"/>
+      <w:lvlText w:val=""/>
+      <w:lvlJc w:val="left"/>
+      <w:pPr>
+        <w:tabs>
+          <w:tab w:val="num" w:pos="3600"/>
+        </w:tabs>
+        <w:ind w:left="3600" w:hanging="360"/>
+      </w:pPr>
+      <w:rPr>
+        <w:rFonts w:ascii="Wingdings" w:hAnsi="Wingdings" w:hint="default"/>
+        <w:sz w:val="20"/>
+      </w:rPr>
+    </w:lvl>
+    <w:lvl w:ilvl="5" w:tentative="1">
+      <w:start w:val="1"/>
+      <w:numFmt w:val="bullet"/>
+      <w:lvlText w:val=""/>
+      <w:lvlJc w:val="left"/>
+      <w:pPr>
+        <w:tabs>
+          <w:tab w:val="num" w:pos="4320"/>
+        </w:tabs>
+        <w:ind w:left="4320" w:hanging="360"/>
+      </w:pPr>
+      <w:rPr>
+        <w:rFonts w:ascii="Wingdings" w:hAnsi="Wingdings" w:hint="default"/>
+        <w:sz w:val="20"/>
+      </w:rPr>
+    </w:lvl>
+    <w:lvl w:ilvl="6" w:tentative="1">
+      <w:start w:val="1"/>
+      <w:numFmt w:val="bullet"/>
+      <w:lvlText w:val=""/>
+      <w:lvlJc w:val="left"/>
+      <w:pPr>
+        <w:tabs>
+          <w:tab w:val="num" w:pos="5040"/>
+        </w:tabs>
+        <w:ind w:left="5040" w:hanging="360"/>
+      </w:pPr>
+      <w:rPr>
+        <w:rFonts w:ascii="Wingdings" w:hAnsi="Wingdings" w:hint="default"/>
+        <w:sz w:val="20"/>
+      </w:rPr>
+    </w:lvl>
+    <w:lvl w:ilvl="7" w:tentative="1">
+      <w:start w:val="1"/>
+      <w:numFmt w:val="bullet"/>
+      <w:lvlText w:val=""/>
+      <w:lvlJc w:val="left"/>
+      <w:pPr>
+        <w:tabs>
+          <w:tab w:val="num" w:pos="5760"/>
+        </w:tabs>
+        <w:ind w:left="5760" w:hanging="360"/>
+      </w:pPr>
+      <w:rPr>
+        <w:rFonts w:ascii="Wingdings" w:hAnsi="Wingdings" w:hint="default"/>
+        <w:sz w:val="20"/>
+      </w:rPr>
+    </w:lvl>
+    <w:lvl w:ilvl="8" w:tentative="1">
+      <w:start w:val="1"/>
+      <w:numFmt w:val="bullet"/>
+      <w:lvlText w:val=""/>
+      <w:lvlJc w:val="left"/>
+      <w:pPr>
+        <w:tabs>
+          <w:tab w:val="num" w:pos="6480"/>
+        </w:tabs>
+        <w:ind w:left="6480" w:hanging="360"/>
+      </w:pPr>
+      <w:rPr>
+        <w:rFonts w:ascii="Wingdings" w:hAnsi="Wingdings" w:hint="default"/>
+        <w:sz w:val="20"/>
+      </w:rPr>
+    </w:lvl>
+  </w:abstractNum>
   <w:num w:numId="1" w16cid:durableId="9110842">
     <w:abstractNumId w:val="3"/>
   </w:num>
@@ -2039,6 +2452,9 @@
   </w:num>
   <w:num w:numId="5" w16cid:durableId="940525626">
     <w:abstractNumId w:val="1"/>
+  </w:num>
+  <w:num w:numId="6" w16cid:durableId="918708348">
+    <w:abstractNumId w:val="5"/>
   </w:num>
 </w:numbering>
 </file>

</xml_diff>

<commit_message>
Proje 4: Otomatik failover otomasyon kodları eklendi.
</commit_message>
<xml_diff>
--- a/BLM4522_Proje4/Proje4_Rapor.docx
+++ b/BLM4522_Proje4/Proje4_Rapor.docx
@@ -450,7 +450,7 @@
           <w:r>
             <w:fldChar w:fldCharType="separate"/>
           </w:r>
-          <w:hyperlink w:anchor="_Toc231234659" w:history="1">
+          <w:hyperlink w:anchor="_Toc231234945" w:history="1">
             <w:r>
               <w:rPr>
                 <w:rStyle w:val="Kpr"/>
@@ -477,7 +477,7 @@
                 <w:noProof/>
                 <w:webHidden/>
               </w:rPr>
-              <w:instrText xml:space="preserve"> PAGEREF _Toc231234659 \h </w:instrText>
+              <w:instrText xml:space="preserve"> PAGEREF _Toc231234945 \h </w:instrText>
             </w:r>
             <w:r>
               <w:rPr>
@@ -521,7 +521,7 @@
               <w14:ligatures w14:val="standardContextual"/>
             </w:rPr>
           </w:pPr>
-          <w:hyperlink w:anchor="_Toc231234660" w:history="1">
+          <w:hyperlink w:anchor="_Toc231234946" w:history="1">
             <w:r>
               <w:rPr>
                 <w:rStyle w:val="Kpr"/>
@@ -548,7 +548,7 @@
                 <w:noProof/>
                 <w:webHidden/>
               </w:rPr>
-              <w:instrText xml:space="preserve"> PAGEREF _Toc231234660 \h </w:instrText>
+              <w:instrText xml:space="preserve"> PAGEREF _Toc231234946 \h </w:instrText>
             </w:r>
             <w:r>
               <w:rPr>
@@ -592,7 +592,7 @@
               <w14:ligatures w14:val="standardContextual"/>
             </w:rPr>
           </w:pPr>
-          <w:hyperlink w:anchor="_Toc231234661" w:history="1">
+          <w:hyperlink w:anchor="_Toc231234947" w:history="1">
             <w:r>
               <w:rPr>
                 <w:rStyle w:val="Kpr"/>
@@ -619,7 +619,7 @@
                 <w:noProof/>
                 <w:webHidden/>
               </w:rPr>
-              <w:instrText xml:space="preserve"> PAGEREF _Toc231234661 \h </w:instrText>
+              <w:instrText xml:space="preserve"> PAGEREF _Toc231234947 \h </w:instrText>
             </w:r>
             <w:r>
               <w:rPr>
@@ -663,7 +663,7 @@
               <w14:ligatures w14:val="standardContextual"/>
             </w:rPr>
           </w:pPr>
-          <w:hyperlink w:anchor="_Toc231234662" w:history="1">
+          <w:hyperlink w:anchor="_Toc231234948" w:history="1">
             <w:r>
               <w:rPr>
                 <w:rStyle w:val="Kpr"/>
@@ -690,7 +690,7 @@
                 <w:noProof/>
                 <w:webHidden/>
               </w:rPr>
-              <w:instrText xml:space="preserve"> PAGEREF _Toc231234662 \h </w:instrText>
+              <w:instrText xml:space="preserve"> PAGEREF _Toc231234948 \h </w:instrText>
             </w:r>
             <w:r>
               <w:rPr>
@@ -734,7 +734,7 @@
               <w14:ligatures w14:val="standardContextual"/>
             </w:rPr>
           </w:pPr>
-          <w:hyperlink w:anchor="_Toc231234663" w:history="1">
+          <w:hyperlink w:anchor="_Toc231234949" w:history="1">
             <w:r>
               <w:rPr>
                 <w:rStyle w:val="Kpr"/>
@@ -761,7 +761,7 @@
                 <w:noProof/>
                 <w:webHidden/>
               </w:rPr>
-              <w:instrText xml:space="preserve"> PAGEREF _Toc231234663 \h </w:instrText>
+              <w:instrText xml:space="preserve"> PAGEREF _Toc231234949 \h </w:instrText>
             </w:r>
             <w:r>
               <w:rPr>
@@ -782,6 +782,77 @@
                 <w:webHidden/>
               </w:rPr>
               <w:t>5</w:t>
+            </w:r>
+            <w:r>
+              <w:rPr>
+                <w:noProof/>
+                <w:webHidden/>
+              </w:rPr>
+              <w:fldChar w:fldCharType="end"/>
+            </w:r>
+          </w:hyperlink>
+        </w:p>
+        <w:p>
+          <w:pPr>
+            <w:pStyle w:val="T2"/>
+            <w:rPr>
+              <w:rFonts w:asciiTheme="minorHAnsi" w:eastAsiaTheme="minorEastAsia" w:hAnsiTheme="minorHAnsi" w:cstheme="minorBidi"/>
+              <w:b w:val="0"/>
+              <w:noProof/>
+              <w:kern w:val="2"/>
+              <w:u w:val="none"/>
+              <w:lang w:eastAsia="tr-TR"/>
+              <w14:ligatures w14:val="standardContextual"/>
+            </w:rPr>
+          </w:pPr>
+          <w:hyperlink w:anchor="_Toc231234950" w:history="1">
+            <w:r>
+              <w:rPr>
+                <w:rStyle w:val="Kpr"/>
+                <w:noProof/>
+              </w:rPr>
+              <w:t>ADIM 5: Otomatik Sağlık Tarayıcı (Health Monitor) ve Failover Tetikleyici</w:t>
+            </w:r>
+            <w:r>
+              <w:rPr>
+                <w:noProof/>
+                <w:webHidden/>
+              </w:rPr>
+              <w:tab/>
+            </w:r>
+            <w:r>
+              <w:rPr>
+                <w:noProof/>
+                <w:webHidden/>
+              </w:rPr>
+              <w:fldChar w:fldCharType="begin"/>
+            </w:r>
+            <w:r>
+              <w:rPr>
+                <w:noProof/>
+                <w:webHidden/>
+              </w:rPr>
+              <w:instrText xml:space="preserve"> PAGEREF _Toc231234950 \h </w:instrText>
+            </w:r>
+            <w:r>
+              <w:rPr>
+                <w:noProof/>
+                <w:webHidden/>
+              </w:rPr>
+            </w:r>
+            <w:r>
+              <w:rPr>
+                <w:noProof/>
+                <w:webHidden/>
+              </w:rPr>
+              <w:fldChar w:fldCharType="separate"/>
+            </w:r>
+            <w:r>
+              <w:rPr>
+                <w:noProof/>
+                <w:webHidden/>
+              </w:rPr>
+              <w:t>6</w:t>
             </w:r>
             <w:r>
               <w:rPr>
@@ -833,7 +904,7 @@
         <w:pStyle w:val="Balk1"/>
         <w:jc w:val="center"/>
       </w:pPr>
-      <w:bookmarkStart w:id="0" w:name="_Toc231234659"/>
+      <w:bookmarkStart w:id="0" w:name="_Toc231234945"/>
       <w:r>
         <w:lastRenderedPageBreak/>
         <w:t xml:space="preserve">Proje </w:t>
@@ -876,7 +947,7 @@
       <w:pPr>
         <w:pStyle w:val="Balk2"/>
       </w:pPr>
-      <w:bookmarkStart w:id="1" w:name="_Toc231234660"/>
+      <w:bookmarkStart w:id="1" w:name="_Toc231234946"/>
       <w:r>
         <w:t>ADIM 1: Yüksek Erişilebilirlik ve Yük Dengeleme İletişim Altyapısının Yapılandırılması</w:t>
       </w:r>
@@ -1022,7 +1093,7 @@
       <w:pPr>
         <w:pStyle w:val="Balk2"/>
       </w:pPr>
-      <w:bookmarkStart w:id="2" w:name="_Toc231234661"/>
+      <w:bookmarkStart w:id="2" w:name="_Toc231234947"/>
       <w:r>
         <w:t xml:space="preserve">ADIM 2: </w:t>
       </w:r>
@@ -1172,7 +1243,7 @@
       <w:pPr>
         <w:pStyle w:val="Balk2"/>
       </w:pPr>
-      <w:bookmarkStart w:id="3" w:name="_Toc231234662"/>
+      <w:bookmarkStart w:id="3" w:name="_Toc231234948"/>
       <w:r>
         <w:t xml:space="preserve">ADIM 3: </w:t>
       </w:r>
@@ -1349,7 +1420,7 @@
       <w:pPr>
         <w:pStyle w:val="Balk2"/>
       </w:pPr>
-      <w:bookmarkStart w:id="4" w:name="_Toc231234663"/>
+      <w:bookmarkStart w:id="4" w:name="_Toc231234949"/>
       <w:r>
         <w:t>ADIM 4: Dinamik Yük Dengeleyici (</w:t>
       </w:r>
@@ -1381,10 +1452,7 @@
     </w:p>
     <w:p>
       <w:r>
-        <w:t>Y</w:t>
-      </w:r>
-      <w:r>
-        <w:t xml:space="preserve">ük dengeleme stratejilerinin yazılımsal olarak modellenmesi amacıyla, kurumsal mimarilerde kullanılan </w:t>
+        <w:t xml:space="preserve">Yük dengeleme stratejilerinin yazılımsal olarak modellenmesi amacıyla, kurumsal mimarilerde kullanılan </w:t>
       </w:r>
       <w:r>
         <w:rPr>
@@ -1494,6 +1562,9 @@
     </w:p>
     <w:p>
       <w:r>
+        <w:rPr>
+          <w:noProof/>
+        </w:rPr>
         <w:drawing>
           <wp:inline distT="0" distB="0" distL="0" distR="0" wp14:anchorId="29B818B2" wp14:editId="683426FE">
             <wp:extent cx="5760720" cy="1389380"/>
@@ -1532,6 +1603,185 @@
       </w:r>
     </w:p>
     <w:p/>
+    <w:p>
+      <w:r>
+        <w:lastRenderedPageBreak/>
+        <w:t>01.06.2026</w:t>
+      </w:r>
+    </w:p>
+    <w:p>
+      <w:pPr>
+        <w:pStyle w:val="Balk2"/>
+      </w:pPr>
+      <w:bookmarkStart w:id="5" w:name="_Toc231234950"/>
+      <w:r>
+        <w:t>ADIM 5: Otomatik Sağlık Tarayıcı (</w:t>
+      </w:r>
+      <w:proofErr w:type="spellStart"/>
+      <w:r>
+        <w:t>Health</w:t>
+      </w:r>
+      <w:proofErr w:type="spellEnd"/>
+      <w:r>
+        <w:t xml:space="preserve"> </w:t>
+      </w:r>
+      <w:proofErr w:type="spellStart"/>
+      <w:r>
+        <w:t>Monitor</w:t>
+      </w:r>
+      <w:proofErr w:type="spellEnd"/>
+      <w:r>
+        <w:t xml:space="preserve">) ve </w:t>
+      </w:r>
+      <w:proofErr w:type="spellStart"/>
+      <w:r>
+        <w:t>Failover</w:t>
+      </w:r>
+      <w:proofErr w:type="spellEnd"/>
+      <w:r>
+        <w:t xml:space="preserve"> Tetikleyici</w:t>
+      </w:r>
+      <w:bookmarkEnd w:id="5"/>
+    </w:p>
+    <w:p>
+      <w:r>
+        <w:t>B</w:t>
+      </w:r>
+      <w:r>
+        <w:t>aşarısız bir sunucuya geçiş (</w:t>
+      </w:r>
+      <w:proofErr w:type="spellStart"/>
+      <w:r>
+        <w:t>failover</w:t>
+      </w:r>
+      <w:proofErr w:type="spellEnd"/>
+      <w:r>
+        <w:t xml:space="preserve">) senaryolarının insan müdahalesi olmaksızın otomatikleştirilmesi amacıyla bir sistem izleme ajanı simüle edilmiştir. Bu kapsamda </w:t>
+      </w:r>
+      <w:proofErr w:type="spellStart"/>
+      <w:r>
+        <w:t>sp_AutomaticFailoverMonitor</w:t>
+      </w:r>
+      <w:proofErr w:type="spellEnd"/>
+      <w:r>
+        <w:t xml:space="preserve"> isimli saklı yordam ile ana sunucunun erişilebilirlik durumu anlık olarak denetlenmektedir.</w:t>
+      </w:r>
+    </w:p>
+    <w:p>
+      <w:proofErr w:type="spellStart"/>
+      <w:r>
+        <w:t>Failover</w:t>
+      </w:r>
+      <w:proofErr w:type="spellEnd"/>
+      <w:r>
+        <w:t xml:space="preserve"> Otomasyon Bulguları:</w:t>
+      </w:r>
+    </w:p>
+    <w:p>
+      <w:pPr>
+        <w:numPr>
+          <w:ilvl w:val="0"/>
+          <w:numId w:val="7"/>
+        </w:numPr>
+      </w:pPr>
+      <w:r>
+        <w:t xml:space="preserve">Geliştirilen izleme mekanizmasının, ana </w:t>
+      </w:r>
+      <w:proofErr w:type="spellStart"/>
+      <w:r>
+        <w:t>veritabanının</w:t>
+      </w:r>
+      <w:proofErr w:type="spellEnd"/>
+      <w:r>
+        <w:t xml:space="preserve"> </w:t>
+      </w:r>
+      <w:proofErr w:type="spellStart"/>
+      <w:r>
+        <w:t>state_desc</w:t>
+      </w:r>
+      <w:proofErr w:type="spellEnd"/>
+      <w:r>
+        <w:t xml:space="preserve"> (durum belirteci) verisini sürekli olarak taradığı ve sistem sağlığını kontrol ettiği gözlemlenmiştir.</w:t>
+      </w:r>
+    </w:p>
+    <w:p>
+      <w:pPr>
+        <w:numPr>
+          <w:ilvl w:val="0"/>
+          <w:numId w:val="7"/>
+        </w:numPr>
+      </w:pPr>
+      <w:r>
+        <w:t>Olası bir çökme veya erişim kesintisi durumunda, sistemin tehlike moduna geçtiği ve tüm veri trafiğini saniyeler içinde otomatik olarak yedek AdventureWorks2019_Replica sunucusuna aktardığı belirlenmiştir.</w:t>
+      </w:r>
+    </w:p>
+    <w:p>
+      <w:pPr>
+        <w:numPr>
+          <w:ilvl w:val="0"/>
+          <w:numId w:val="7"/>
+        </w:numPr>
+      </w:pPr>
+      <w:r>
+        <w:t xml:space="preserve">Bu proaktif izleme altyapısı sayesinde, dağıtık </w:t>
+      </w:r>
+      <w:proofErr w:type="spellStart"/>
+      <w:r>
+        <w:t>veritabanı</w:t>
+      </w:r>
+      <w:proofErr w:type="spellEnd"/>
+      <w:r>
+        <w:t xml:space="preserve"> yapılarında sıfır veri kaybı ve sıfır kesinti hedefi başarıyla yerine getirilmektedir.</w:t>
+      </w:r>
+    </w:p>
+    <w:p>
+      <w:pPr>
+        <w:ind w:left="720"/>
+      </w:pPr>
+    </w:p>
+    <w:p>
+      <w:pPr>
+        <w:ind w:left="720"/>
+      </w:pPr>
+      <w:r>
+        <w:drawing>
+          <wp:inline distT="0" distB="0" distL="0" distR="0" wp14:anchorId="3C16BAE4" wp14:editId="1D5E42DF">
+            <wp:extent cx="3541776" cy="632460"/>
+            <wp:effectExtent l="0" t="0" r="1905" b="0"/>
+            <wp:docPr id="1202467296" name="Resim 1"/>
+            <wp:cNvGraphicFramePr>
+              <a:graphicFrameLocks xmlns:a="http://schemas.openxmlformats.org/drawingml/2006/main" noChangeAspect="1"/>
+            </wp:cNvGraphicFramePr>
+            <a:graphic xmlns:a="http://schemas.openxmlformats.org/drawingml/2006/main">
+              <a:graphicData uri="http://schemas.openxmlformats.org/drawingml/2006/picture">
+                <pic:pic xmlns:pic="http://schemas.openxmlformats.org/drawingml/2006/picture">
+                  <pic:nvPicPr>
+                    <pic:cNvPr id="1202467296" name=""/>
+                    <pic:cNvPicPr/>
+                  </pic:nvPicPr>
+                  <pic:blipFill>
+                    <a:blip r:embed="rId10"/>
+                    <a:stretch>
+                      <a:fillRect/>
+                    </a:stretch>
+                  </pic:blipFill>
+                  <pic:spPr>
+                    <a:xfrm>
+                      <a:off x="0" y="0"/>
+                      <a:ext cx="3543397" cy="632749"/>
+                    </a:xfrm>
+                    <a:prstGeom prst="rect">
+                      <a:avLst/>
+                    </a:prstGeom>
+                  </pic:spPr>
+                </pic:pic>
+              </a:graphicData>
+            </a:graphic>
+          </wp:inline>
+        </w:drawing>
+      </w:r>
+    </w:p>
+    <w:p/>
     <w:sectPr>
       <w:pgSz w:w="11906" w:h="16838"/>
       <w:pgMar w:top="1417" w:right="1417" w:bottom="1417" w:left="1417" w:header="708" w:footer="708" w:gutter="0"/>
@@ -1694,6 +1944,155 @@
     </w:lvl>
   </w:abstractNum>
   <w:abstractNum w:abstractNumId="1" w15:restartNumberingAfterBreak="0">
+    <w:nsid w:val="1A185314"/>
+    <w:multiLevelType w:val="multilevel"/>
+    <w:tmpl w:val="BC64C114"/>
+    <w:lvl w:ilvl="0">
+      <w:start w:val="1"/>
+      <w:numFmt w:val="bullet"/>
+      <w:lvlText w:val=""/>
+      <w:lvlJc w:val="left"/>
+      <w:pPr>
+        <w:tabs>
+          <w:tab w:val="num" w:pos="720"/>
+        </w:tabs>
+        <w:ind w:left="720" w:hanging="360"/>
+      </w:pPr>
+      <w:rPr>
+        <w:rFonts w:ascii="Symbol" w:hAnsi="Symbol" w:hint="default"/>
+        <w:sz w:val="20"/>
+      </w:rPr>
+    </w:lvl>
+    <w:lvl w:ilvl="1" w:tentative="1">
+      <w:start w:val="1"/>
+      <w:numFmt w:val="bullet"/>
+      <w:lvlText w:val="o"/>
+      <w:lvlJc w:val="left"/>
+      <w:pPr>
+        <w:tabs>
+          <w:tab w:val="num" w:pos="1440"/>
+        </w:tabs>
+        <w:ind w:left="1440" w:hanging="360"/>
+      </w:pPr>
+      <w:rPr>
+        <w:rFonts w:ascii="Courier New" w:hAnsi="Courier New" w:hint="default"/>
+        <w:sz w:val="20"/>
+      </w:rPr>
+    </w:lvl>
+    <w:lvl w:ilvl="2" w:tentative="1">
+      <w:start w:val="1"/>
+      <w:numFmt w:val="bullet"/>
+      <w:lvlText w:val=""/>
+      <w:lvlJc w:val="left"/>
+      <w:pPr>
+        <w:tabs>
+          <w:tab w:val="num" w:pos="2160"/>
+        </w:tabs>
+        <w:ind w:left="2160" w:hanging="360"/>
+      </w:pPr>
+      <w:rPr>
+        <w:rFonts w:ascii="Wingdings" w:hAnsi="Wingdings" w:hint="default"/>
+        <w:sz w:val="20"/>
+      </w:rPr>
+    </w:lvl>
+    <w:lvl w:ilvl="3" w:tentative="1">
+      <w:start w:val="1"/>
+      <w:numFmt w:val="bullet"/>
+      <w:lvlText w:val=""/>
+      <w:lvlJc w:val="left"/>
+      <w:pPr>
+        <w:tabs>
+          <w:tab w:val="num" w:pos="2880"/>
+        </w:tabs>
+        <w:ind w:left="2880" w:hanging="360"/>
+      </w:pPr>
+      <w:rPr>
+        <w:rFonts w:ascii="Wingdings" w:hAnsi="Wingdings" w:hint="default"/>
+        <w:sz w:val="20"/>
+      </w:rPr>
+    </w:lvl>
+    <w:lvl w:ilvl="4" w:tentative="1">
+      <w:start w:val="1"/>
+      <w:numFmt w:val="bullet"/>
+      <w:lvlText w:val=""/>
+      <w:lvlJc w:val="left"/>
+      <w:pPr>
+        <w:tabs>
+          <w:tab w:val="num" w:pos="3600"/>
+        </w:tabs>
+        <w:ind w:left="3600" w:hanging="360"/>
+      </w:pPr>
+      <w:rPr>
+        <w:rFonts w:ascii="Wingdings" w:hAnsi="Wingdings" w:hint="default"/>
+        <w:sz w:val="20"/>
+      </w:rPr>
+    </w:lvl>
+    <w:lvl w:ilvl="5" w:tentative="1">
+      <w:start w:val="1"/>
+      <w:numFmt w:val="bullet"/>
+      <w:lvlText w:val=""/>
+      <w:lvlJc w:val="left"/>
+      <w:pPr>
+        <w:tabs>
+          <w:tab w:val="num" w:pos="4320"/>
+        </w:tabs>
+        <w:ind w:left="4320" w:hanging="360"/>
+      </w:pPr>
+      <w:rPr>
+        <w:rFonts w:ascii="Wingdings" w:hAnsi="Wingdings" w:hint="default"/>
+        <w:sz w:val="20"/>
+      </w:rPr>
+    </w:lvl>
+    <w:lvl w:ilvl="6" w:tentative="1">
+      <w:start w:val="1"/>
+      <w:numFmt w:val="bullet"/>
+      <w:lvlText w:val=""/>
+      <w:lvlJc w:val="left"/>
+      <w:pPr>
+        <w:tabs>
+          <w:tab w:val="num" w:pos="5040"/>
+        </w:tabs>
+        <w:ind w:left="5040" w:hanging="360"/>
+      </w:pPr>
+      <w:rPr>
+        <w:rFonts w:ascii="Wingdings" w:hAnsi="Wingdings" w:hint="default"/>
+        <w:sz w:val="20"/>
+      </w:rPr>
+    </w:lvl>
+    <w:lvl w:ilvl="7" w:tentative="1">
+      <w:start w:val="1"/>
+      <w:numFmt w:val="bullet"/>
+      <w:lvlText w:val=""/>
+      <w:lvlJc w:val="left"/>
+      <w:pPr>
+        <w:tabs>
+          <w:tab w:val="num" w:pos="5760"/>
+        </w:tabs>
+        <w:ind w:left="5760" w:hanging="360"/>
+      </w:pPr>
+      <w:rPr>
+        <w:rFonts w:ascii="Wingdings" w:hAnsi="Wingdings" w:hint="default"/>
+        <w:sz w:val="20"/>
+      </w:rPr>
+    </w:lvl>
+    <w:lvl w:ilvl="8" w:tentative="1">
+      <w:start w:val="1"/>
+      <w:numFmt w:val="bullet"/>
+      <w:lvlText w:val=""/>
+      <w:lvlJc w:val="left"/>
+      <w:pPr>
+        <w:tabs>
+          <w:tab w:val="num" w:pos="6480"/>
+        </w:tabs>
+        <w:ind w:left="6480" w:hanging="360"/>
+      </w:pPr>
+      <w:rPr>
+        <w:rFonts w:ascii="Wingdings" w:hAnsi="Wingdings" w:hint="default"/>
+        <w:sz w:val="20"/>
+      </w:rPr>
+    </w:lvl>
+  </w:abstractNum>
+  <w:abstractNum w:abstractNumId="2" w15:restartNumberingAfterBreak="0">
     <w:nsid w:val="47C16E30"/>
     <w:multiLevelType w:val="multilevel"/>
     <w:tmpl w:val="F5ECE3FA"/>
@@ -1842,7 +2241,7 @@
       </w:rPr>
     </w:lvl>
   </w:abstractNum>
-  <w:abstractNum w:abstractNumId="2" w15:restartNumberingAfterBreak="0">
+  <w:abstractNum w:abstractNumId="3" w15:restartNumberingAfterBreak="0">
     <w:nsid w:val="4AA44615"/>
     <w:multiLevelType w:val="multilevel"/>
     <w:tmpl w:val="AB5A4BA6"/>
@@ -1991,7 +2390,7 @@
       </w:rPr>
     </w:lvl>
   </w:abstractNum>
-  <w:abstractNum w:abstractNumId="3" w15:restartNumberingAfterBreak="0">
+  <w:abstractNum w:abstractNumId="4" w15:restartNumberingAfterBreak="0">
     <w:nsid w:val="526E1E29"/>
     <w:multiLevelType w:val="multilevel"/>
     <w:tmpl w:val="9066FC7E"/>
@@ -2140,7 +2539,7 @@
       </w:rPr>
     </w:lvl>
   </w:abstractNum>
-  <w:abstractNum w:abstractNumId="4" w15:restartNumberingAfterBreak="0">
+  <w:abstractNum w:abstractNumId="5" w15:restartNumberingAfterBreak="0">
     <w:nsid w:val="53F477C9"/>
     <w:multiLevelType w:val="multilevel"/>
     <w:tmpl w:val="56A44A76"/>
@@ -2289,7 +2688,7 @@
       </w:rPr>
     </w:lvl>
   </w:abstractNum>
-  <w:abstractNum w:abstractNumId="5" w15:restartNumberingAfterBreak="0">
+  <w:abstractNum w:abstractNumId="6" w15:restartNumberingAfterBreak="0">
     <w:nsid w:val="764C09D5"/>
     <w:multiLevelType w:val="multilevel"/>
     <w:tmpl w:val="A15836E6"/>
@@ -2439,22 +2838,25 @@
     </w:lvl>
   </w:abstractNum>
   <w:num w:numId="1" w16cid:durableId="9110842">
-    <w:abstractNumId w:val="3"/>
+    <w:abstractNumId w:val="4"/>
   </w:num>
   <w:num w:numId="2" w16cid:durableId="612175472">
     <w:abstractNumId w:val="0"/>
   </w:num>
   <w:num w:numId="3" w16cid:durableId="76681063">
-    <w:abstractNumId w:val="4"/>
+    <w:abstractNumId w:val="5"/>
   </w:num>
   <w:num w:numId="4" w16cid:durableId="1447119027">
+    <w:abstractNumId w:val="3"/>
+  </w:num>
+  <w:num w:numId="5" w16cid:durableId="940525626">
     <w:abstractNumId w:val="2"/>
   </w:num>
-  <w:num w:numId="5" w16cid:durableId="940525626">
+  <w:num w:numId="6" w16cid:durableId="918708348">
+    <w:abstractNumId w:val="6"/>
+  </w:num>
+  <w:num w:numId="7" w16cid:durableId="1546942308">
     <w:abstractNumId w:val="1"/>
-  </w:num>
-  <w:num w:numId="6" w16cid:durableId="918708348">
-    <w:abstractNumId w:val="5"/>
   </w:num>
 </w:numbering>
 </file>

</xml_diff>

<commit_message>
Proje 4: Raporun sonuç kısmı tamamlandı ve proje sonlandırıldı.
</commit_message>
<xml_diff>
--- a/BLM4522_Proje4/Proje4_Rapor.docx
+++ b/BLM4522_Proje4/Proje4_Rapor.docx
@@ -450,7 +450,7 @@
           <w:r>
             <w:fldChar w:fldCharType="separate"/>
           </w:r>
-          <w:hyperlink w:anchor="_Toc231234945" w:history="1">
+          <w:hyperlink w:anchor="_Toc231235150" w:history="1">
             <w:r>
               <w:rPr>
                 <w:rStyle w:val="Kpr"/>
@@ -477,7 +477,7 @@
                 <w:noProof/>
                 <w:webHidden/>
               </w:rPr>
-              <w:instrText xml:space="preserve"> PAGEREF _Toc231234945 \h </w:instrText>
+              <w:instrText xml:space="preserve"> PAGEREF _Toc231235150 \h </w:instrText>
             </w:r>
             <w:r>
               <w:rPr>
@@ -521,7 +521,7 @@
               <w14:ligatures w14:val="standardContextual"/>
             </w:rPr>
           </w:pPr>
-          <w:hyperlink w:anchor="_Toc231234946" w:history="1">
+          <w:hyperlink w:anchor="_Toc231235151" w:history="1">
             <w:r>
               <w:rPr>
                 <w:rStyle w:val="Kpr"/>
@@ -548,7 +548,7 @@
                 <w:noProof/>
                 <w:webHidden/>
               </w:rPr>
-              <w:instrText xml:space="preserve"> PAGEREF _Toc231234946 \h </w:instrText>
+              <w:instrText xml:space="preserve"> PAGEREF _Toc231235151 \h </w:instrText>
             </w:r>
             <w:r>
               <w:rPr>
@@ -592,7 +592,7 @@
               <w14:ligatures w14:val="standardContextual"/>
             </w:rPr>
           </w:pPr>
-          <w:hyperlink w:anchor="_Toc231234947" w:history="1">
+          <w:hyperlink w:anchor="_Toc231235152" w:history="1">
             <w:r>
               <w:rPr>
                 <w:rStyle w:val="Kpr"/>
@@ -619,7 +619,7 @@
                 <w:noProof/>
                 <w:webHidden/>
               </w:rPr>
-              <w:instrText xml:space="preserve"> PAGEREF _Toc231234947 \h </w:instrText>
+              <w:instrText xml:space="preserve"> PAGEREF _Toc231235152 \h </w:instrText>
             </w:r>
             <w:r>
               <w:rPr>
@@ -663,7 +663,7 @@
               <w14:ligatures w14:val="standardContextual"/>
             </w:rPr>
           </w:pPr>
-          <w:hyperlink w:anchor="_Toc231234948" w:history="1">
+          <w:hyperlink w:anchor="_Toc231235153" w:history="1">
             <w:r>
               <w:rPr>
                 <w:rStyle w:val="Kpr"/>
@@ -690,7 +690,7 @@
                 <w:noProof/>
                 <w:webHidden/>
               </w:rPr>
-              <w:instrText xml:space="preserve"> PAGEREF _Toc231234948 \h </w:instrText>
+              <w:instrText xml:space="preserve"> PAGEREF _Toc231235153 \h </w:instrText>
             </w:r>
             <w:r>
               <w:rPr>
@@ -734,7 +734,7 @@
               <w14:ligatures w14:val="standardContextual"/>
             </w:rPr>
           </w:pPr>
-          <w:hyperlink w:anchor="_Toc231234949" w:history="1">
+          <w:hyperlink w:anchor="_Toc231235154" w:history="1">
             <w:r>
               <w:rPr>
                 <w:rStyle w:val="Kpr"/>
@@ -761,7 +761,7 @@
                 <w:noProof/>
                 <w:webHidden/>
               </w:rPr>
-              <w:instrText xml:space="preserve"> PAGEREF _Toc231234949 \h </w:instrText>
+              <w:instrText xml:space="preserve"> PAGEREF _Toc231235154 \h </w:instrText>
             </w:r>
             <w:r>
               <w:rPr>
@@ -805,7 +805,7 @@
               <w14:ligatures w14:val="standardContextual"/>
             </w:rPr>
           </w:pPr>
-          <w:hyperlink w:anchor="_Toc231234950" w:history="1">
+          <w:hyperlink w:anchor="_Toc231235155" w:history="1">
             <w:r>
               <w:rPr>
                 <w:rStyle w:val="Kpr"/>
@@ -832,7 +832,7 @@
                 <w:noProof/>
                 <w:webHidden/>
               </w:rPr>
-              <w:instrText xml:space="preserve"> PAGEREF _Toc231234950 \h </w:instrText>
+              <w:instrText xml:space="preserve"> PAGEREF _Toc231235155 \h </w:instrText>
             </w:r>
             <w:r>
               <w:rPr>
@@ -853,6 +853,77 @@
                 <w:webHidden/>
               </w:rPr>
               <w:t>6</w:t>
+            </w:r>
+            <w:r>
+              <w:rPr>
+                <w:noProof/>
+                <w:webHidden/>
+              </w:rPr>
+              <w:fldChar w:fldCharType="end"/>
+            </w:r>
+          </w:hyperlink>
+        </w:p>
+        <w:p>
+          <w:pPr>
+            <w:pStyle w:val="T2"/>
+            <w:rPr>
+              <w:rFonts w:asciiTheme="minorHAnsi" w:eastAsiaTheme="minorEastAsia" w:hAnsiTheme="minorHAnsi" w:cstheme="minorBidi"/>
+              <w:b w:val="0"/>
+              <w:noProof/>
+              <w:kern w:val="2"/>
+              <w:u w:val="none"/>
+              <w:lang w:eastAsia="tr-TR"/>
+              <w14:ligatures w14:val="standardContextual"/>
+            </w:rPr>
+          </w:pPr>
+          <w:hyperlink w:anchor="_Toc231235156" w:history="1">
+            <w:r>
+              <w:rPr>
+                <w:rStyle w:val="Kpr"/>
+                <w:noProof/>
+              </w:rPr>
+              <w:t>Adım 6: Sonuç</w:t>
+            </w:r>
+            <w:r>
+              <w:rPr>
+                <w:noProof/>
+                <w:webHidden/>
+              </w:rPr>
+              <w:tab/>
+            </w:r>
+            <w:r>
+              <w:rPr>
+                <w:noProof/>
+                <w:webHidden/>
+              </w:rPr>
+              <w:fldChar w:fldCharType="begin"/>
+            </w:r>
+            <w:r>
+              <w:rPr>
+                <w:noProof/>
+                <w:webHidden/>
+              </w:rPr>
+              <w:instrText xml:space="preserve"> PAGEREF _Toc231235156 \h </w:instrText>
+            </w:r>
+            <w:r>
+              <w:rPr>
+                <w:noProof/>
+                <w:webHidden/>
+              </w:rPr>
+            </w:r>
+            <w:r>
+              <w:rPr>
+                <w:noProof/>
+                <w:webHidden/>
+              </w:rPr>
+              <w:fldChar w:fldCharType="separate"/>
+            </w:r>
+            <w:r>
+              <w:rPr>
+                <w:noProof/>
+                <w:webHidden/>
+              </w:rPr>
+              <w:t>7</w:t>
             </w:r>
             <w:r>
               <w:rPr>
@@ -904,9 +975,8 @@
         <w:pStyle w:val="Balk1"/>
         <w:jc w:val="center"/>
       </w:pPr>
-      <w:bookmarkStart w:id="0" w:name="_Toc231234945"/>
-      <w:r>
-        <w:lastRenderedPageBreak/>
+      <w:bookmarkStart w:id="0" w:name="_Toc231235150"/>
+      <w:r>
         <w:t xml:space="preserve">Proje </w:t>
       </w:r>
       <w:proofErr w:type="gramStart"/>
@@ -947,7 +1017,7 @@
       <w:pPr>
         <w:pStyle w:val="Balk2"/>
       </w:pPr>
-      <w:bookmarkStart w:id="1" w:name="_Toc231234946"/>
+      <w:bookmarkStart w:id="1" w:name="_Toc231235151"/>
       <w:r>
         <w:t>ADIM 1: Yüksek Erişilebilirlik ve Yük Dengeleme İletişim Altyapısının Yapılandırılması</w:t>
       </w:r>
@@ -1085,7 +1155,6 @@
     <w:p/>
     <w:p>
       <w:r>
-        <w:lastRenderedPageBreak/>
         <w:t>01.06.2026</w:t>
       </w:r>
     </w:p>
@@ -1093,7 +1162,7 @@
       <w:pPr>
         <w:pStyle w:val="Balk2"/>
       </w:pPr>
-      <w:bookmarkStart w:id="2" w:name="_Toc231234947"/>
+      <w:bookmarkStart w:id="2" w:name="_Toc231235152"/>
       <w:r>
         <w:t xml:space="preserve">ADIM 2: </w:t>
       </w:r>
@@ -1243,7 +1312,7 @@
       <w:pPr>
         <w:pStyle w:val="Balk2"/>
       </w:pPr>
-      <w:bookmarkStart w:id="3" w:name="_Toc231234948"/>
+      <w:bookmarkStart w:id="3" w:name="_Toc231235153"/>
       <w:r>
         <w:t xml:space="preserve">ADIM 3: </w:t>
       </w:r>
@@ -1420,7 +1489,7 @@
       <w:pPr>
         <w:pStyle w:val="Balk2"/>
       </w:pPr>
-      <w:bookmarkStart w:id="4" w:name="_Toc231234949"/>
+      <w:bookmarkStart w:id="4" w:name="_Toc231235154"/>
       <w:r>
         <w:t>ADIM 4: Dinamik Yük Dengeleyici (</w:t>
       </w:r>
@@ -1613,7 +1682,7 @@
       <w:pPr>
         <w:pStyle w:val="Balk2"/>
       </w:pPr>
-      <w:bookmarkStart w:id="5" w:name="_Toc231234950"/>
+      <w:bookmarkStart w:id="5" w:name="_Toc231235155"/>
       <w:r>
         <w:t>ADIM 5: Otomatik Sağlık Tarayıcı (</w:t>
       </w:r>
@@ -1645,10 +1714,7 @@
     </w:p>
     <w:p>
       <w:r>
-        <w:t>B</w:t>
-      </w:r>
-      <w:r>
-        <w:t>aşarısız bir sunucuya geçiş (</w:t>
+        <w:t>Başarısız bir sunucuya geçiş (</w:t>
       </w:r>
       <w:proofErr w:type="spellStart"/>
       <w:r>
@@ -1744,6 +1810,9 @@
         <w:ind w:left="720"/>
       </w:pPr>
       <w:r>
+        <w:rPr>
+          <w:noProof/>
+        </w:rPr>
         <w:drawing>
           <wp:inline distT="0" distB="0" distL="0" distR="0" wp14:anchorId="3C16BAE4" wp14:editId="1D5E42DF">
             <wp:extent cx="3541776" cy="632460"/>
@@ -1782,6 +1851,176 @@
       </w:r>
     </w:p>
     <w:p/>
+    <w:p/>
+    <w:p/>
+    <w:p/>
+    <w:p/>
+    <w:p/>
+    <w:p/>
+    <w:p/>
+    <w:p/>
+    <w:p/>
+    <w:p/>
+    <w:p/>
+    <w:p>
+      <w:r>
+        <w:lastRenderedPageBreak/>
+        <w:t>01.06.2026</w:t>
+      </w:r>
+    </w:p>
+    <w:p>
+      <w:pPr>
+        <w:pStyle w:val="Balk2"/>
+      </w:pPr>
+      <w:bookmarkStart w:id="6" w:name="_Toc231235156"/>
+      <w:r>
+        <w:t>Adım 6: Sonuç</w:t>
+      </w:r>
+      <w:bookmarkEnd w:id="6"/>
+    </w:p>
+    <w:p>
+      <w:r>
+        <w:t xml:space="preserve">Bu proje kapsamında, AdventureWorks2019 </w:t>
+      </w:r>
+      <w:proofErr w:type="spellStart"/>
+      <w:r>
+        <w:t>veritabanı</w:t>
+      </w:r>
+      <w:proofErr w:type="spellEnd"/>
+      <w:r>
+        <w:t xml:space="preserve"> üzerinde yük dengeleme, dağıtık </w:t>
+      </w:r>
+      <w:proofErr w:type="spellStart"/>
+      <w:r>
+        <w:t>veritabanı</w:t>
+      </w:r>
+      <w:proofErr w:type="spellEnd"/>
+      <w:r>
+        <w:t xml:space="preserve"> mimarisi ve replikasyon senaryoları gelişmiş T-SQL çözümleriyle başarıyla modellenmiştir. Süreç boyunca elde edilen kazanımlar şu şekildedir:</w:t>
+      </w:r>
+    </w:p>
+    <w:p>
+      <w:pPr>
+        <w:numPr>
+          <w:ilvl w:val="0"/>
+          <w:numId w:val="8"/>
+        </w:numPr>
+      </w:pPr>
+      <w:r>
+        <w:t xml:space="preserve">Dağıtık Altyapı ve Replikasyon: Sürüm kısıtlamaları nedeniyle </w:t>
+      </w:r>
+      <w:proofErr w:type="spellStart"/>
+      <w:r>
+        <w:rPr>
+          <w:i/>
+          <w:iCs/>
+        </w:rPr>
+        <w:t>Linked</w:t>
+      </w:r>
+      <w:proofErr w:type="spellEnd"/>
+      <w:r>
+        <w:rPr>
+          <w:i/>
+          <w:iCs/>
+        </w:rPr>
+        <w:t xml:space="preserve"> Server</w:t>
+      </w:r>
+      <w:r>
+        <w:t xml:space="preserve"> mimarisi kurulmuş; ana </w:t>
+      </w:r>
+      <w:proofErr w:type="spellStart"/>
+      <w:r>
+        <w:t>veritabanındaki</w:t>
+      </w:r>
+      <w:proofErr w:type="spellEnd"/>
+      <w:r>
+        <w:t xml:space="preserve"> verilerin yedek (AdventureWorks2019_Replica) </w:t>
+      </w:r>
+      <w:proofErr w:type="spellStart"/>
+      <w:r>
+        <w:t>veritabanına</w:t>
+      </w:r>
+      <w:proofErr w:type="spellEnd"/>
+      <w:r>
+        <w:t xml:space="preserve"> veri kaybı olmaksızın anlık aktarımı sağlanmıştır.</w:t>
+      </w:r>
+    </w:p>
+    <w:p>
+      <w:pPr>
+        <w:numPr>
+          <w:ilvl w:val="0"/>
+          <w:numId w:val="8"/>
+        </w:numPr>
+      </w:pPr>
+      <w:r>
+        <w:t xml:space="preserve">Dinamik Yük Dengeleme: Geliştirilen </w:t>
+      </w:r>
+      <w:proofErr w:type="spellStart"/>
+      <w:r>
+        <w:t>sp_DatabaseLoadBalancer</w:t>
+      </w:r>
+      <w:proofErr w:type="spellEnd"/>
+      <w:r>
+        <w:t xml:space="preserve"> yordamı ile okuma (READ) ve yazma (WRITE) talepleri analiz edilerek uygun sunuculara dağıtılmış, böylece ana sunucu yükü optimize edilmiştir.</w:t>
+      </w:r>
+    </w:p>
+    <w:p>
+      <w:pPr>
+        <w:numPr>
+          <w:ilvl w:val="0"/>
+          <w:numId w:val="8"/>
+        </w:numPr>
+      </w:pPr>
+      <w:r>
+        <w:t xml:space="preserve">Otomatik </w:t>
+      </w:r>
+      <w:proofErr w:type="spellStart"/>
+      <w:r>
+        <w:t>Failover</w:t>
+      </w:r>
+      <w:proofErr w:type="spellEnd"/>
+      <w:r>
+        <w:t xml:space="preserve"> Kontrolü: Tasarlanan </w:t>
+      </w:r>
+      <w:proofErr w:type="spellStart"/>
+      <w:r>
+        <w:t>sp_AutomaticFailoverMonitor</w:t>
+      </w:r>
+      <w:proofErr w:type="spellEnd"/>
+      <w:r>
+        <w:t xml:space="preserve"> mekanizması ile sistem sağlığı canlı olarak taranmıştır. Ana </w:t>
+      </w:r>
+      <w:proofErr w:type="spellStart"/>
+      <w:r>
+        <w:t>veritabanının</w:t>
+      </w:r>
+      <w:proofErr w:type="spellEnd"/>
+      <w:r>
+        <w:t xml:space="preserve"> kapandığı çökme senaryosunda, trafiğin otomatik olarak yedek </w:t>
+      </w:r>
+      <w:proofErr w:type="spellStart"/>
+      <w:r>
+        <w:t>veritabanına</w:t>
+      </w:r>
+      <w:proofErr w:type="spellEnd"/>
+      <w:r>
+        <w:t xml:space="preserve"> kaydırıldığı ve iş sürekliliğinin kesintisiz korunduğu tespit edilmiştir.</w:t>
+      </w:r>
+    </w:p>
+    <w:p>
+      <w:r>
+        <w:t xml:space="preserve">Sonuç olarak, donanımsal veya lisans tabanlı kısıtlamalara rağmen, proaktif yazılım çözümleriyle kurumsal düzeyde bir yüksek erişilebilirlik (High </w:t>
+      </w:r>
+      <w:proofErr w:type="spellStart"/>
+      <w:r>
+        <w:t>Availability</w:t>
+      </w:r>
+      <w:proofErr w:type="spellEnd"/>
+      <w:r>
+        <w:t>) altyapısının oluşturulabileceği başarıyla ortaya konulmuştur.</w:t>
+      </w:r>
+    </w:p>
+    <w:p/>
     <w:sectPr>
       <w:pgSz w:w="11906" w:h="16838"/>
       <w:pgMar w:top="1417" w:right="1417" w:bottom="1417" w:left="1417" w:header="708" w:footer="708" w:gutter="0"/>
@@ -2093,6 +2332,155 @@
     </w:lvl>
   </w:abstractNum>
   <w:abstractNum w:abstractNumId="2" w15:restartNumberingAfterBreak="0">
+    <w:nsid w:val="20F45912"/>
+    <w:multiLevelType w:val="multilevel"/>
+    <w:tmpl w:val="A044E8FA"/>
+    <w:lvl w:ilvl="0">
+      <w:start w:val="1"/>
+      <w:numFmt w:val="bullet"/>
+      <w:lvlText w:val=""/>
+      <w:lvlJc w:val="left"/>
+      <w:pPr>
+        <w:tabs>
+          <w:tab w:val="num" w:pos="720"/>
+        </w:tabs>
+        <w:ind w:left="720" w:hanging="360"/>
+      </w:pPr>
+      <w:rPr>
+        <w:rFonts w:ascii="Symbol" w:hAnsi="Symbol" w:hint="default"/>
+        <w:sz w:val="20"/>
+      </w:rPr>
+    </w:lvl>
+    <w:lvl w:ilvl="1" w:tentative="1">
+      <w:start w:val="1"/>
+      <w:numFmt w:val="bullet"/>
+      <w:lvlText w:val="o"/>
+      <w:lvlJc w:val="left"/>
+      <w:pPr>
+        <w:tabs>
+          <w:tab w:val="num" w:pos="1440"/>
+        </w:tabs>
+        <w:ind w:left="1440" w:hanging="360"/>
+      </w:pPr>
+      <w:rPr>
+        <w:rFonts w:ascii="Courier New" w:hAnsi="Courier New" w:hint="default"/>
+        <w:sz w:val="20"/>
+      </w:rPr>
+    </w:lvl>
+    <w:lvl w:ilvl="2" w:tentative="1">
+      <w:start w:val="1"/>
+      <w:numFmt w:val="bullet"/>
+      <w:lvlText w:val=""/>
+      <w:lvlJc w:val="left"/>
+      <w:pPr>
+        <w:tabs>
+          <w:tab w:val="num" w:pos="2160"/>
+        </w:tabs>
+        <w:ind w:left="2160" w:hanging="360"/>
+      </w:pPr>
+      <w:rPr>
+        <w:rFonts w:ascii="Wingdings" w:hAnsi="Wingdings" w:hint="default"/>
+        <w:sz w:val="20"/>
+      </w:rPr>
+    </w:lvl>
+    <w:lvl w:ilvl="3" w:tentative="1">
+      <w:start w:val="1"/>
+      <w:numFmt w:val="bullet"/>
+      <w:lvlText w:val=""/>
+      <w:lvlJc w:val="left"/>
+      <w:pPr>
+        <w:tabs>
+          <w:tab w:val="num" w:pos="2880"/>
+        </w:tabs>
+        <w:ind w:left="2880" w:hanging="360"/>
+      </w:pPr>
+      <w:rPr>
+        <w:rFonts w:ascii="Wingdings" w:hAnsi="Wingdings" w:hint="default"/>
+        <w:sz w:val="20"/>
+      </w:rPr>
+    </w:lvl>
+    <w:lvl w:ilvl="4" w:tentative="1">
+      <w:start w:val="1"/>
+      <w:numFmt w:val="bullet"/>
+      <w:lvlText w:val=""/>
+      <w:lvlJc w:val="left"/>
+      <w:pPr>
+        <w:tabs>
+          <w:tab w:val="num" w:pos="3600"/>
+        </w:tabs>
+        <w:ind w:left="3600" w:hanging="360"/>
+      </w:pPr>
+      <w:rPr>
+        <w:rFonts w:ascii="Wingdings" w:hAnsi="Wingdings" w:hint="default"/>
+        <w:sz w:val="20"/>
+      </w:rPr>
+    </w:lvl>
+    <w:lvl w:ilvl="5" w:tentative="1">
+      <w:start w:val="1"/>
+      <w:numFmt w:val="bullet"/>
+      <w:lvlText w:val=""/>
+      <w:lvlJc w:val="left"/>
+      <w:pPr>
+        <w:tabs>
+          <w:tab w:val="num" w:pos="4320"/>
+        </w:tabs>
+        <w:ind w:left="4320" w:hanging="360"/>
+      </w:pPr>
+      <w:rPr>
+        <w:rFonts w:ascii="Wingdings" w:hAnsi="Wingdings" w:hint="default"/>
+        <w:sz w:val="20"/>
+      </w:rPr>
+    </w:lvl>
+    <w:lvl w:ilvl="6" w:tentative="1">
+      <w:start w:val="1"/>
+      <w:numFmt w:val="bullet"/>
+      <w:lvlText w:val=""/>
+      <w:lvlJc w:val="left"/>
+      <w:pPr>
+        <w:tabs>
+          <w:tab w:val="num" w:pos="5040"/>
+        </w:tabs>
+        <w:ind w:left="5040" w:hanging="360"/>
+      </w:pPr>
+      <w:rPr>
+        <w:rFonts w:ascii="Wingdings" w:hAnsi="Wingdings" w:hint="default"/>
+        <w:sz w:val="20"/>
+      </w:rPr>
+    </w:lvl>
+    <w:lvl w:ilvl="7" w:tentative="1">
+      <w:start w:val="1"/>
+      <w:numFmt w:val="bullet"/>
+      <w:lvlText w:val=""/>
+      <w:lvlJc w:val="left"/>
+      <w:pPr>
+        <w:tabs>
+          <w:tab w:val="num" w:pos="5760"/>
+        </w:tabs>
+        <w:ind w:left="5760" w:hanging="360"/>
+      </w:pPr>
+      <w:rPr>
+        <w:rFonts w:ascii="Wingdings" w:hAnsi="Wingdings" w:hint="default"/>
+        <w:sz w:val="20"/>
+      </w:rPr>
+    </w:lvl>
+    <w:lvl w:ilvl="8" w:tentative="1">
+      <w:start w:val="1"/>
+      <w:numFmt w:val="bullet"/>
+      <w:lvlText w:val=""/>
+      <w:lvlJc w:val="left"/>
+      <w:pPr>
+        <w:tabs>
+          <w:tab w:val="num" w:pos="6480"/>
+        </w:tabs>
+        <w:ind w:left="6480" w:hanging="360"/>
+      </w:pPr>
+      <w:rPr>
+        <w:rFonts w:ascii="Wingdings" w:hAnsi="Wingdings" w:hint="default"/>
+        <w:sz w:val="20"/>
+      </w:rPr>
+    </w:lvl>
+  </w:abstractNum>
+  <w:abstractNum w:abstractNumId="3" w15:restartNumberingAfterBreak="0">
     <w:nsid w:val="47C16E30"/>
     <w:multiLevelType w:val="multilevel"/>
     <w:tmpl w:val="F5ECE3FA"/>
@@ -2241,7 +2629,7 @@
       </w:rPr>
     </w:lvl>
   </w:abstractNum>
-  <w:abstractNum w:abstractNumId="3" w15:restartNumberingAfterBreak="0">
+  <w:abstractNum w:abstractNumId="4" w15:restartNumberingAfterBreak="0">
     <w:nsid w:val="4AA44615"/>
     <w:multiLevelType w:val="multilevel"/>
     <w:tmpl w:val="AB5A4BA6"/>
@@ -2390,7 +2778,7 @@
       </w:rPr>
     </w:lvl>
   </w:abstractNum>
-  <w:abstractNum w:abstractNumId="4" w15:restartNumberingAfterBreak="0">
+  <w:abstractNum w:abstractNumId="5" w15:restartNumberingAfterBreak="0">
     <w:nsid w:val="526E1E29"/>
     <w:multiLevelType w:val="multilevel"/>
     <w:tmpl w:val="9066FC7E"/>
@@ -2539,7 +2927,7 @@
       </w:rPr>
     </w:lvl>
   </w:abstractNum>
-  <w:abstractNum w:abstractNumId="5" w15:restartNumberingAfterBreak="0">
+  <w:abstractNum w:abstractNumId="6" w15:restartNumberingAfterBreak="0">
     <w:nsid w:val="53F477C9"/>
     <w:multiLevelType w:val="multilevel"/>
     <w:tmpl w:val="56A44A76"/>
@@ -2688,7 +3076,7 @@
       </w:rPr>
     </w:lvl>
   </w:abstractNum>
-  <w:abstractNum w:abstractNumId="6" w15:restartNumberingAfterBreak="0">
+  <w:abstractNum w:abstractNumId="7" w15:restartNumberingAfterBreak="0">
     <w:nsid w:val="764C09D5"/>
     <w:multiLevelType w:val="multilevel"/>
     <w:tmpl w:val="A15836E6"/>
@@ -2838,25 +3226,28 @@
     </w:lvl>
   </w:abstractNum>
   <w:num w:numId="1" w16cid:durableId="9110842">
-    <w:abstractNumId w:val="4"/>
+    <w:abstractNumId w:val="5"/>
   </w:num>
   <w:num w:numId="2" w16cid:durableId="612175472">
     <w:abstractNumId w:val="0"/>
   </w:num>
   <w:num w:numId="3" w16cid:durableId="76681063">
-    <w:abstractNumId w:val="5"/>
+    <w:abstractNumId w:val="6"/>
   </w:num>
   <w:num w:numId="4" w16cid:durableId="1447119027">
+    <w:abstractNumId w:val="4"/>
+  </w:num>
+  <w:num w:numId="5" w16cid:durableId="940525626">
     <w:abstractNumId w:val="3"/>
   </w:num>
-  <w:num w:numId="5" w16cid:durableId="940525626">
-    <w:abstractNumId w:val="2"/>
-  </w:num>
   <w:num w:numId="6" w16cid:durableId="918708348">
-    <w:abstractNumId w:val="6"/>
+    <w:abstractNumId w:val="7"/>
   </w:num>
   <w:num w:numId="7" w16cid:durableId="1546942308">
     <w:abstractNumId w:val="1"/>
+  </w:num>
+  <w:num w:numId="8" w16cid:durableId="1129713138">
+    <w:abstractNumId w:val="2"/>
   </w:num>
 </w:numbering>
 </file>

</xml_diff>